<commit_message>
Update developer setup guide (docx/pdf); ignore Office lock files
Co-authored-by: Cursor <cursoragent@cursor.com>
</commit_message>
<xml_diff>
--- a/Hotel_Booking_Ops_Setup_Guide.docx
+++ b/Hotel_Booking_Ops_Setup_Guide.docx
@@ -1,35 +1,35 @@
 
 <file path=word/document.xml><?xml version="1.0" encoding="utf-8"?>
-<w:document xmlns:w="http://schemas.openxmlformats.org/wordprocessingml/2006/main">
+<w:document xmlns:wpc="http://schemas.microsoft.com/office/word/2010/wordprocessingCanvas" xmlns:cx="http://schemas.microsoft.com/office/drawing/2014/chartex" xmlns:cx1="http://schemas.microsoft.com/office/drawing/2015/9/8/chartex" xmlns:cx2="http://schemas.microsoft.com/office/drawing/2015/10/21/chartex" xmlns:cx3="http://schemas.microsoft.com/office/drawing/2016/5/9/chartex" xmlns:cx4="http://schemas.microsoft.com/office/drawing/2016/5/10/chartex" xmlns:cx5="http://schemas.microsoft.com/office/drawing/2016/5/11/chartex" xmlns:cx6="http://schemas.microsoft.com/office/drawing/2016/5/12/chartex" xmlns:cx7="http://schemas.microsoft.com/office/drawing/2016/5/13/chartex" xmlns:cx8="http://schemas.microsoft.com/office/drawing/2016/5/14/chartex" xmlns:mc="http://schemas.openxmlformats.org/markup-compatibility/2006" xmlns:aink="http://schemas.microsoft.com/office/drawing/2016/ink" xmlns:am3d="http://schemas.microsoft.com/office/drawing/2017/model3d" xmlns:o="urn:schemas-microsoft-com:office:office" xmlns:oel="http://schemas.microsoft.com/office/2019/extlst" xmlns:r="http://schemas.openxmlformats.org/officeDocument/2006/relationships" xmlns:m="http://schemas.openxmlformats.org/officeDocument/2006/math" xmlns:v="urn:schemas-microsoft-com:vml" xmlns:wp14="http://schemas.microsoft.com/office/word/2010/wordprocessingDrawing" xmlns:wp="http://schemas.openxmlformats.org/drawingml/2006/wordprocessingDrawing" xmlns:w10="urn:schemas-microsoft-com:office:word" xmlns:w="http://schemas.openxmlformats.org/wordprocessingml/2006/main" xmlns:w14="http://schemas.microsoft.com/office/word/2010/wordml" xmlns:w15="http://schemas.microsoft.com/office/word/2012/wordml" xmlns:w16cex="http://schemas.microsoft.com/office/word/2018/wordml/cex" xmlns:w16cid="http://schemas.microsoft.com/office/word/2016/wordml/cid" xmlns:w16="http://schemas.microsoft.com/office/word/2018/wordml" xmlns:w16du="http://schemas.microsoft.com/office/word/2023/wordml/word16du" xmlns:w16sdtdh="http://schemas.microsoft.com/office/word/2020/wordml/sdtdatahash" xmlns:w16sdtfl="http://schemas.microsoft.com/office/word/2024/wordml/sdtformatlock" xmlns:w16se="http://schemas.microsoft.com/office/word/2015/wordml/symex" xmlns:wpg="http://schemas.microsoft.com/office/word/2010/wordprocessingGroup" xmlns:wpi="http://schemas.microsoft.com/office/word/2010/wordprocessingInk" xmlns:wne="http://schemas.microsoft.com/office/word/2006/wordml" xmlns:wps="http://schemas.microsoft.com/office/word/2010/wordprocessingShape" mc:Ignorable="w14 w15 w16se w16cid w16 w16cex w16sdtdh w16sdtfl w16du wp14">
   <w:body>
     <w:p>
       <w:pPr>
-        <w:spacing w:before="0" w:after="40" w:line="240" w:lineRule="auto"/>
-      </w:pPr>
-      <w:r>
-        <w:rPr>
+        <w:spacing w:after="40" w:line="240" w:lineRule="auto"/>
+      </w:pPr>
+      <w:r>
+        <w:rPr>
+          <w:rFonts w:ascii="Calibri Light" w:hAnsi="Calibri Light" w:cs="Calibri Light"/>
           <w:b/>
           <w:color w:val="1F3864"/>
-          <w:rFonts w:ascii="Calibri Light" w:hAnsi="Calibri Light" w:cs="Calibri Light"/>
           <w:sz w:val="56"/>
           <w:szCs w:val="56"/>
         </w:rPr>
-        <w:t xml:space="preserve">Hotel Booking Ops V5</w:t>
-      </w:r>
-    </w:p>
-    <w:p>
-      <w:pPr>
-        <w:spacing w:before="0" w:after="240" w:line="240" w:lineRule="auto"/>
-      </w:pPr>
-      <w:r>
-        <w:rPr>
+        <w:t>Hotel Booking Ops V5</w:t>
+      </w:r>
+    </w:p>
+    <w:p>
+      <w:pPr>
+        <w:spacing w:after="240" w:line="240" w:lineRule="auto"/>
+      </w:pPr>
+      <w:r>
+        <w:rPr>
+          <w:rFonts w:ascii="Calibri Light" w:hAnsi="Calibri Light" w:cs="Calibri Light"/>
           <w:i/>
           <w:color w:val="595959"/>
-          <w:rFonts w:ascii="Calibri Light" w:hAnsi="Calibri Light" w:cs="Calibri Light"/>
           <w:sz w:val="26"/>
           <w:szCs w:val="26"/>
         </w:rPr>
-        <w:t xml:space="preserve">Developer Setup Guide — Getting the project running after cloning</w:t>
+        <w:t>Developer Setup Guide — Getting the project running after cloning</w:t>
       </w:r>
     </w:p>
     <w:p>
@@ -37,24 +37,15 @@
         <w:pBdr>
           <w:bottom w:val="single" w:sz="12" w:space="1" w:color="2F5496"/>
         </w:pBdr>
-        <w:spacing w:before="0" w:after="120" w:line="276" w:lineRule="auto"/>
-      </w:pPr>
-    </w:p>
-    <w:p>
-      <w:pPr>
-        <w:spacing w:before="0" w:after="160" w:line="276" w:lineRule="auto"/>
-      </w:pPr>
-      <w:r>
-        <w:t xml:space="preserve">This guide explains how to turn a fresh clone of the repository into a fully working </w:t>
-      </w:r>
-      <w:r>
-        <w:t xml:space="preserve">Laravel</w:t>
-      </w:r>
-      <w:r>
-        <w:t xml:space="preserve"> application. It is written for new team members and assumes you are </w:t>
-      </w:r>
-      <w:r>
-        <w:t xml:space="preserve">starting from a clean machine with the project just cloned from GitHub.</w:t>
+        <w:spacing w:after="120" w:line="276" w:lineRule="auto"/>
+      </w:pPr>
+    </w:p>
+    <w:p>
+      <w:pPr>
+        <w:spacing w:line="276" w:lineRule="auto"/>
+      </w:pPr>
+      <w:r>
+        <w:t>This guide explains how to turn a fresh clone of the repository into a fully working Laravel application. It is written for new team members and assumes you are starting from a clean machine with the project just cloned from GitHub.</w:t>
       </w:r>
     </w:p>
     <w:p>
@@ -67,26 +58,26 @@
       </w:pPr>
       <w:r>
         <w:rPr>
+          <w:rFonts w:ascii="Calibri Light" w:hAnsi="Calibri Light" w:cs="Calibri Light"/>
           <w:b/>
           <w:color w:val="2F5496"/>
-          <w:rFonts w:ascii="Calibri Light" w:hAnsi="Calibri Light" w:cs="Calibri Light"/>
           <w:sz w:val="32"/>
           <w:szCs w:val="32"/>
         </w:rPr>
-        <w:t xml:space="preserve">1.  Project Overview</w:t>
-      </w:r>
-    </w:p>
-    <w:p>
-      <w:pPr>
-        <w:spacing w:before="0" w:after="160" w:line="276" w:lineRule="auto"/>
-      </w:pPr>
-      <w:r>
-        <w:t xml:space="preserve">This is a Laravel 12 application using the following stack:</w:t>
-      </w:r>
-    </w:p>
-    <w:p>
-      <w:pPr>
-        <w:spacing w:before="0" w:after="80" w:line="276" w:lineRule="auto"/>
+        <w:t>1.  Project Overview</w:t>
+      </w:r>
+    </w:p>
+    <w:p>
+      <w:pPr>
+        <w:spacing w:line="276" w:lineRule="auto"/>
+      </w:pPr>
+      <w:r>
+        <w:t>This is a Laravel 12 application using the following stack:</w:t>
+      </w:r>
+    </w:p>
+    <w:p>
+      <w:pPr>
+        <w:spacing w:after="80" w:line="276" w:lineRule="auto"/>
         <w:ind w:left="360" w:hanging="360"/>
       </w:pPr>
       <w:r>
@@ -103,12 +94,12 @@
         <w:t xml:space="preserve">Backend: </w:t>
       </w:r>
       <w:r>
-        <w:t xml:space="preserve">PHP 8.2+ with Laravel 12, Livewire 3, Sanctum</w:t>
-      </w:r>
-    </w:p>
-    <w:p>
-      <w:pPr>
-        <w:spacing w:before="0" w:after="80" w:line="276" w:lineRule="auto"/>
+        <w:t>PHP 8.2+ with Laravel 12, Livewire 3, Sanctum</w:t>
+      </w:r>
+    </w:p>
+    <w:p>
+      <w:pPr>
+        <w:spacing w:after="80" w:line="276" w:lineRule="auto"/>
         <w:ind w:left="360" w:hanging="360"/>
       </w:pPr>
       <w:r>
@@ -125,12 +116,12 @@
         <w:t xml:space="preserve">Frontend: </w:t>
       </w:r>
       <w:r>
-        <w:t xml:space="preserve">Vite 7, Tailwind CSS 3, Alpine.js</w:t>
-      </w:r>
-    </w:p>
-    <w:p>
-      <w:pPr>
-        <w:spacing w:before="0" w:after="80" w:line="276" w:lineRule="auto"/>
+        <w:t>Vite 7, Tailwind CSS 3, Alpine.js</w:t>
+      </w:r>
+    </w:p>
+    <w:p>
+      <w:pPr>
+        <w:spacing w:after="80" w:line="276" w:lineRule="auto"/>
         <w:ind w:left="360" w:hanging="360"/>
       </w:pPr>
       <w:r>
@@ -147,12 +138,12 @@
         <w:t xml:space="preserve">Database: </w:t>
       </w:r>
       <w:r>
-        <w:t xml:space="preserve">MySQL (via XAMPP) or SQLite</w:t>
-      </w:r>
-    </w:p>
-    <w:p>
-      <w:pPr>
-        <w:spacing w:before="0" w:after="80" w:line="276" w:lineRule="auto"/>
+        <w:t>MySQL (via XAMPP) or SQLite</w:t>
+      </w:r>
+    </w:p>
+    <w:p>
+      <w:pPr>
+        <w:spacing w:after="80" w:line="276" w:lineRule="auto"/>
         <w:ind w:left="360" w:hanging="360"/>
       </w:pPr>
       <w:r>
@@ -169,7 +160,7 @@
         <w:t xml:space="preserve">Tooling: </w:t>
       </w:r>
       <w:r>
-        <w:t xml:space="preserve">Composer, npm, Pest (tests), Pint (formatting)</w:t>
+        <w:t>Composer, npm, Pest (tests), Pint (formatting)</w:t>
       </w:r>
     </w:p>
     <w:p>
@@ -182,18 +173,18 @@
       </w:pPr>
       <w:r>
         <w:rPr>
+          <w:rFonts w:ascii="Calibri Light" w:hAnsi="Calibri Light" w:cs="Calibri Light"/>
           <w:b/>
           <w:color w:val="2F5496"/>
-          <w:rFonts w:ascii="Calibri Light" w:hAnsi="Calibri Light" w:cs="Calibri Light"/>
           <w:sz w:val="32"/>
           <w:szCs w:val="32"/>
         </w:rPr>
-        <w:t xml:space="preserve">2.  Why the Repository Looks “Incomplete”</w:t>
-      </w:r>
-    </w:p>
-    <w:p>
-      <w:pPr>
-        <w:spacing w:before="0" w:after="160" w:line="276" w:lineRule="auto"/>
+        <w:t>2.  Why the Repository Looks “Incomplete”</w:t>
+      </w:r>
+    </w:p>
+    <w:p>
+      <w:pPr>
+        <w:spacing w:line="276" w:lineRule="auto"/>
       </w:pPr>
       <w:r>
         <w:t xml:space="preserve">After cloning you will </w:t>
@@ -203,55 +194,55 @@
           <w:b/>
           <w:color w:val="C55A11"/>
         </w:rPr>
-        <w:t xml:space="preserve">not</w:t>
+        <w:t>not</w:t>
       </w:r>
       <w:r>
         <w:t xml:space="preserve"> see folders like </w:t>
       </w:r>
       <w:r>
         <w:rPr>
-          <w:color w:val="C55A11"/>
-          <w:rFonts w:ascii="Consolas" w:hAnsi="Consolas" w:cs="Consolas"/>
-          <w:sz w:val="19"/>
-          <w:szCs w:val="19"/>
-        </w:rPr>
-        <w:t xml:space="preserve">vendor/</w:t>
+          <w:rFonts w:ascii="Consolas" w:hAnsi="Consolas" w:cs="Consolas"/>
+          <w:color w:val="C55A11"/>
+          <w:sz w:val="19"/>
+          <w:szCs w:val="19"/>
+        </w:rPr>
+        <w:t>vendor/</w:t>
       </w:r>
       <w:r>
         <w:t xml:space="preserve">, </w:t>
       </w:r>
       <w:r>
         <w:rPr>
-          <w:color w:val="C55A11"/>
-          <w:rFonts w:ascii="Consolas" w:hAnsi="Consolas" w:cs="Consolas"/>
-          <w:sz w:val="19"/>
-          <w:szCs w:val="19"/>
-        </w:rPr>
-        <w:t xml:space="preserve">node_modules/</w:t>
+          <w:rFonts w:ascii="Consolas" w:hAnsi="Consolas" w:cs="Consolas"/>
+          <w:color w:val="C55A11"/>
+          <w:sz w:val="19"/>
+          <w:szCs w:val="19"/>
+        </w:rPr>
+        <w:t>node_modules/</w:t>
       </w:r>
       <w:r>
         <w:t xml:space="preserve">, or a </w:t>
       </w:r>
       <w:r>
         <w:rPr>
-          <w:color w:val="C55A11"/>
-          <w:rFonts w:ascii="Consolas" w:hAnsi="Consolas" w:cs="Consolas"/>
-          <w:sz w:val="19"/>
-          <w:szCs w:val="19"/>
-        </w:rPr>
-        <w:t xml:space="preserve">.env</w:t>
+          <w:rFonts w:ascii="Consolas" w:hAnsi="Consolas" w:cs="Consolas"/>
+          <w:color w:val="C55A11"/>
+          <w:sz w:val="19"/>
+          <w:szCs w:val="19"/>
+        </w:rPr>
+        <w:t>.env</w:t>
       </w:r>
       <w:r>
         <w:t xml:space="preserve"> file. This is intentional — these are listed in </w:t>
       </w:r>
       <w:r>
         <w:rPr>
-          <w:color w:val="C55A11"/>
-          <w:rFonts w:ascii="Consolas" w:hAnsi="Consolas" w:cs="Consolas"/>
-          <w:sz w:val="19"/>
-          <w:szCs w:val="19"/>
-        </w:rPr>
-        <w:t xml:space="preserve">.gitignore</w:t>
+          <w:rFonts w:ascii="Consolas" w:hAnsi="Consolas" w:cs="Consolas"/>
+          <w:color w:val="C55A11"/>
+          <w:sz w:val="19"/>
+          <w:szCs w:val="19"/>
+        </w:rPr>
+        <w:t>.gitignore</w:t>
       </w:r>
       <w:r>
         <w:t xml:space="preserve">. They are never committed because every developer regenerates them locally from the files that </w:t>
@@ -260,58 +251,59 @@
         <w:rPr>
           <w:i/>
         </w:rPr>
-        <w:t xml:space="preserve">are</w:t>
+        <w:t>are</w:t>
       </w:r>
       <w:r>
         <w:t xml:space="preserve"> committed (such as </w:t>
       </w:r>
       <w:r>
         <w:rPr>
-          <w:color w:val="C55A11"/>
-          <w:rFonts w:ascii="Consolas" w:hAnsi="Consolas" w:cs="Consolas"/>
-          <w:sz w:val="19"/>
-          <w:szCs w:val="19"/>
-        </w:rPr>
-        <w:t xml:space="preserve">composer.json</w:t>
+          <w:rFonts w:ascii="Consolas" w:hAnsi="Consolas" w:cs="Consolas"/>
+          <w:color w:val="C55A11"/>
+          <w:sz w:val="19"/>
+          <w:szCs w:val="19"/>
+        </w:rPr>
+        <w:t>composer.json</w:t>
       </w:r>
       <w:r>
         <w:t xml:space="preserve">, </w:t>
       </w:r>
       <w:r>
         <w:rPr>
-          <w:color w:val="C55A11"/>
-          <w:rFonts w:ascii="Consolas" w:hAnsi="Consolas" w:cs="Consolas"/>
-          <w:sz w:val="19"/>
-          <w:szCs w:val="19"/>
-        </w:rPr>
-        <w:t xml:space="preserve">package.json</w:t>
+          <w:rFonts w:ascii="Consolas" w:hAnsi="Consolas" w:cs="Consolas"/>
+          <w:color w:val="C55A11"/>
+          <w:sz w:val="19"/>
+          <w:szCs w:val="19"/>
+        </w:rPr>
+        <w:t>package.json</w:t>
       </w:r>
       <w:r>
         <w:t xml:space="preserve">, and </w:t>
       </w:r>
       <w:r>
         <w:rPr>
-          <w:color w:val="C55A11"/>
-          <w:rFonts w:ascii="Consolas" w:hAnsi="Consolas" w:cs="Consolas"/>
-          <w:sz w:val="19"/>
-          <w:szCs w:val="19"/>
-        </w:rPr>
-        <w:t xml:space="preserve">.env.example</w:t>
-      </w:r>
-      <w:r>
-        <w:t xml:space="preserve">).</w:t>
+          <w:rFonts w:ascii="Consolas" w:hAnsi="Consolas" w:cs="Consolas"/>
+          <w:color w:val="C55A11"/>
+          <w:sz w:val="19"/>
+          <w:szCs w:val="19"/>
+        </w:rPr>
+        <w:t>.env.example</w:t>
+      </w:r>
+      <w:r>
+        <w:t>).</w:t>
       </w:r>
     </w:p>
     <w:tbl>
       <w:tblPr>
         <w:tblW w:w="9360" w:type="dxa"/>
+        <w:tblInd w:w="120" w:type="dxa"/>
         <w:tblBorders>
-          <w:top w:val="single" w:sz="4" w:color="D6DCE5"/>
-          <w:left w:val="single" w:sz="4" w:color="D6DCE5"/>
-          <w:bottom w:val="single" w:sz="4" w:color="D6DCE5"/>
-          <w:right w:val="single" w:sz="4" w:color="D6DCE5"/>
-          <w:insideH w:val="single" w:sz="4" w:color="D6DCE5"/>
-          <w:insideV w:val="single" w:sz="4" w:color="D6DCE5"/>
+          <w:top w:val="single" w:sz="4" w:space="0" w:color="D6DCE5"/>
+          <w:left w:val="single" w:sz="4" w:space="0" w:color="D6DCE5"/>
+          <w:bottom w:val="single" w:sz="4" w:space="0" w:color="D6DCE5"/>
+          <w:right w:val="single" w:sz="4" w:space="0" w:color="D6DCE5"/>
+          <w:insideH w:val="single" w:sz="4" w:space="0" w:color="D6DCE5"/>
+          <w:insideV w:val="single" w:sz="4" w:space="0" w:color="D6DCE5"/>
         </w:tblBorders>
         <w:tblCellMar>
           <w:top w:w="60" w:type="dxa"/>
@@ -319,6 +311,7 @@
           <w:bottom w:w="60" w:type="dxa"/>
           <w:right w:w="120" w:type="dxa"/>
         </w:tblCellMar>
+        <w:tblLook w:val="04A0" w:firstRow="1" w:lastRow="0" w:firstColumn="1" w:lastColumn="0" w:noHBand="0" w:noVBand="1"/>
       </w:tblPr>
       <w:tblGrid>
         <w:gridCol w:w="2600"/>
@@ -346,7 +339,7 @@
                 <w:sz w:val="20"/>
                 <w:szCs w:val="20"/>
               </w:rPr>
-              <w:t xml:space="preserve">Missing item</w:t>
+              <w:t>Missing item</w:t>
             </w:r>
           </w:p>
         </w:tc>
@@ -367,7 +360,7 @@
                 <w:sz w:val="20"/>
                 <w:szCs w:val="20"/>
               </w:rPr>
-              <w:t xml:space="preserve">How it is restored</w:t>
+              <w:t>How it is restored</w:t>
             </w:r>
           </w:p>
         </w:tc>
@@ -388,7 +381,7 @@
                 <w:sz w:val="20"/>
                 <w:szCs w:val="20"/>
               </w:rPr>
-              <w:t xml:space="preserve">Source of truth</w:t>
+              <w:t>Source of truth</w:t>
             </w:r>
           </w:p>
         </w:tc>
@@ -406,12 +399,12 @@
             </w:pPr>
             <w:r>
               <w:rPr>
+                <w:rFonts w:ascii="Consolas" w:hAnsi="Consolas" w:cs="Consolas"/>
                 <w:color w:val="C55A11"/>
-                <w:rFonts w:ascii="Consolas" w:hAnsi="Consolas" w:cs="Consolas"/>
                 <w:sz w:val="19"/>
                 <w:szCs w:val="19"/>
               </w:rPr>
-              <w:t xml:space="preserve">vendor/</w:t>
+              <w:t>vendor/</w:t>
             </w:r>
           </w:p>
         </w:tc>
@@ -430,7 +423,7 @@
                 <w:sz w:val="20"/>
                 <w:szCs w:val="20"/>
               </w:rPr>
-              <w:t xml:space="preserve">composer install</w:t>
+              <w:t>composer install</w:t>
             </w:r>
           </w:p>
         </w:tc>
@@ -449,7 +442,7 @@
                 <w:sz w:val="20"/>
                 <w:szCs w:val="20"/>
               </w:rPr>
-              <w:t xml:space="preserve">composer.json / composer.lock</w:t>
+              <w:t>composer.json / composer.lock</w:t>
             </w:r>
           </w:p>
         </w:tc>
@@ -467,12 +460,12 @@
             </w:pPr>
             <w:r>
               <w:rPr>
+                <w:rFonts w:ascii="Consolas" w:hAnsi="Consolas" w:cs="Consolas"/>
                 <w:color w:val="C55A11"/>
-                <w:rFonts w:ascii="Consolas" w:hAnsi="Consolas" w:cs="Consolas"/>
                 <w:sz w:val="19"/>
                 <w:szCs w:val="19"/>
               </w:rPr>
-              <w:t xml:space="preserve">node_modules/</w:t>
+              <w:t>node_modules/</w:t>
             </w:r>
           </w:p>
         </w:tc>
@@ -491,7 +484,7 @@
                 <w:sz w:val="20"/>
                 <w:szCs w:val="20"/>
               </w:rPr>
-              <w:t xml:space="preserve">npm install</w:t>
+              <w:t>npm install</w:t>
             </w:r>
           </w:p>
         </w:tc>
@@ -510,7 +503,7 @@
                 <w:sz w:val="20"/>
                 <w:szCs w:val="20"/>
               </w:rPr>
-              <w:t xml:space="preserve">package.json / package-lock.json</w:t>
+              <w:t>package.json / package-lock.json</w:t>
             </w:r>
           </w:p>
         </w:tc>
@@ -528,12 +521,12 @@
             </w:pPr>
             <w:r>
               <w:rPr>
+                <w:rFonts w:ascii="Consolas" w:hAnsi="Consolas" w:cs="Consolas"/>
                 <w:color w:val="C55A11"/>
-                <w:rFonts w:ascii="Consolas" w:hAnsi="Consolas" w:cs="Consolas"/>
                 <w:sz w:val="19"/>
                 <w:szCs w:val="19"/>
               </w:rPr>
-              <w:t xml:space="preserve">public/build/</w:t>
+              <w:t>public/build/</w:t>
             </w:r>
           </w:p>
         </w:tc>
@@ -552,7 +545,7 @@
                 <w:sz w:val="20"/>
                 <w:szCs w:val="20"/>
               </w:rPr>
-              <w:t xml:space="preserve">npm run build</w:t>
+              <w:t>npm run build</w:t>
             </w:r>
           </w:p>
         </w:tc>
@@ -571,7 +564,7 @@
                 <w:sz w:val="20"/>
                 <w:szCs w:val="20"/>
               </w:rPr>
-              <w:t xml:space="preserve">Vite + your source assets</w:t>
+              <w:t>Vite + your source assets</w:t>
             </w:r>
           </w:p>
         </w:tc>
@@ -589,12 +582,12 @@
             </w:pPr>
             <w:r>
               <w:rPr>
+                <w:rFonts w:ascii="Consolas" w:hAnsi="Consolas" w:cs="Consolas"/>
                 <w:color w:val="C55A11"/>
-                <w:rFonts w:ascii="Consolas" w:hAnsi="Consolas" w:cs="Consolas"/>
                 <w:sz w:val="19"/>
                 <w:szCs w:val="19"/>
               </w:rPr>
-              <w:t xml:space="preserve">.env</w:t>
+              <w:t>.env</w:t>
             </w:r>
           </w:p>
         </w:tc>
@@ -613,7 +606,7 @@
                 <w:sz w:val="20"/>
                 <w:szCs w:val="20"/>
               </w:rPr>
-              <w:t xml:space="preserve">copy from .env.example</w:t>
+              <w:t>copy from .env.example</w:t>
             </w:r>
           </w:p>
         </w:tc>
@@ -632,7 +625,7 @@
                 <w:sz w:val="20"/>
                 <w:szCs w:val="20"/>
               </w:rPr>
-              <w:t xml:space="preserve">.env.example</w:t>
+              <w:t>.env.example</w:t>
             </w:r>
           </w:p>
         </w:tc>
@@ -653,7 +646,7 @@
                 <w:sz w:val="20"/>
                 <w:szCs w:val="20"/>
               </w:rPr>
-              <w:t xml:space="preserve">Application key</w:t>
+              <w:t>Application key</w:t>
             </w:r>
           </w:p>
         </w:tc>
@@ -672,7 +665,7 @@
                 <w:sz w:val="20"/>
                 <w:szCs w:val="20"/>
               </w:rPr>
-              <w:t xml:space="preserve">php artisan key:generate</w:t>
+              <w:t>php artisan key:generate</w:t>
             </w:r>
           </w:p>
         </w:tc>
@@ -691,7 +684,7 @@
                 <w:sz w:val="20"/>
                 <w:szCs w:val="20"/>
               </w:rPr>
-              <w:t xml:space="preserve">generated locally</w:t>
+              <w:t>generated locally</w:t>
             </w:r>
           </w:p>
         </w:tc>
@@ -709,12 +702,12 @@
             </w:pPr>
             <w:r>
               <w:rPr>
+                <w:rFonts w:ascii="Consolas" w:hAnsi="Consolas" w:cs="Consolas"/>
                 <w:color w:val="C55A11"/>
-                <w:rFonts w:ascii="Consolas" w:hAnsi="Consolas" w:cs="Consolas"/>
                 <w:sz w:val="19"/>
                 <w:szCs w:val="19"/>
               </w:rPr>
-              <w:t xml:space="preserve">public/storage</w:t>
+              <w:t>public/storage</w:t>
             </w:r>
           </w:p>
         </w:tc>
@@ -733,7 +726,7 @@
                 <w:sz w:val="20"/>
                 <w:szCs w:val="20"/>
               </w:rPr>
-              <w:t xml:space="preserve">php artisan storage:link</w:t>
+              <w:t>php artisan storage:link</w:t>
             </w:r>
           </w:p>
         </w:tc>
@@ -752,7 +745,7 @@
                 <w:sz w:val="20"/>
                 <w:szCs w:val="20"/>
               </w:rPr>
-              <w:t xml:space="preserve">symlink to storage/app/public</w:t>
+              <w:t>symlink to storage/app/public</w:t>
             </w:r>
           </w:p>
         </w:tc>
@@ -773,7 +766,7 @@
                 <w:sz w:val="20"/>
                 <w:szCs w:val="20"/>
               </w:rPr>
-              <w:t xml:space="preserve">storage caches &amp; logs</w:t>
+              <w:t>storage caches &amp; logs</w:t>
             </w:r>
           </w:p>
         </w:tc>
@@ -792,7 +785,7 @@
                 <w:sz w:val="20"/>
                 <w:szCs w:val="20"/>
               </w:rPr>
-              <w:t xml:space="preserve">created by Laravel at runtime</w:t>
+              <w:t>created by Laravel at runtime</w:t>
             </w:r>
           </w:p>
         </w:tc>
@@ -811,7 +804,7 @@
                 <w:sz w:val="20"/>
                 <w:szCs w:val="20"/>
               </w:rPr>
-              <w:t xml:space="preserve">n/a</w:t>
+              <w:t>n/a</w:t>
             </w:r>
           </w:p>
         </w:tc>
@@ -819,19 +812,19 @@
     </w:tbl>
     <w:p>
       <w:pPr>
-        <w:spacing w:before="0" w:after="120" w:line="120" w:lineRule="auto"/>
-      </w:pPr>
-    </w:p>
-    <w:p>
-      <w:pPr>
-        <w:shd w:val="clear" w:color="auto" w:fill="FFF4E5"/>
+        <w:spacing w:after="120" w:line="120" w:lineRule="auto"/>
+      </w:pPr>
+    </w:p>
+    <w:p>
+      <w:pPr>
         <w:pBdr>
           <w:top w:val="single" w:sz="6" w:space="4" w:color="C55A11"/>
           <w:left w:val="single" w:sz="24" w:space="6" w:color="C55A11"/>
           <w:bottom w:val="single" w:sz="6" w:space="4" w:color="C55A11"/>
           <w:right w:val="single" w:sz="6" w:space="4" w:color="C55A11"/>
         </w:pBdr>
-        <w:spacing w:before="120" w:after="160" w:line="276" w:lineRule="auto"/>
+        <w:shd w:val="clear" w:color="auto" w:fill="FFF4E5"/>
+        <w:spacing w:before="120" w:line="276" w:lineRule="auto"/>
         <w:ind w:left="120"/>
       </w:pPr>
       <w:r>
@@ -842,7 +835,7 @@
         <w:t xml:space="preserve">Why it matters:  </w:t>
       </w:r>
       <w:r>
-        <w:t xml:space="preserve">Committing these would bloat the repo, cause constant merge conflicts, and leak secrets. Keeping them ignored is the correct, standard Laravel practice.</w:t>
+        <w:t>Committing these would bloat the repo, cause constant merge conflicts, and leak secrets. Keeping them ignored is the correct, standard Laravel practice.</w:t>
       </w:r>
     </w:p>
     <w:p>
@@ -855,26 +848,27 @@
       </w:pPr>
       <w:r>
         <w:rPr>
+          <w:rFonts w:ascii="Calibri Light" w:hAnsi="Calibri Light" w:cs="Calibri Light"/>
           <w:b/>
           <w:color w:val="2F5496"/>
-          <w:rFonts w:ascii="Calibri Light" w:hAnsi="Calibri Light" w:cs="Calibri Light"/>
           <w:sz w:val="32"/>
           <w:szCs w:val="32"/>
         </w:rPr>
-        <w:t xml:space="preserve">3.  Prerequisites</w:t>
-      </w:r>
-    </w:p>
-    <w:p>
-      <w:pPr>
-        <w:spacing w:before="0" w:after="160" w:line="276" w:lineRule="auto"/>
-      </w:pPr>
-      <w:r>
-        <w:t xml:space="preserve">Make sure the following are installed before you begin:</w:t>
-      </w:r>
-    </w:p>
-    <w:p>
-      <w:pPr>
-        <w:spacing w:before="0" w:after="80" w:line="276" w:lineRule="auto"/>
+        <w:lastRenderedPageBreak/>
+        <w:t>3.  Prerequisites</w:t>
+      </w:r>
+    </w:p>
+    <w:p>
+      <w:pPr>
+        <w:spacing w:line="276" w:lineRule="auto"/>
+      </w:pPr>
+      <w:r>
+        <w:t>Make sure the following are installed before you begin:</w:t>
+      </w:r>
+    </w:p>
+    <w:p>
+      <w:pPr>
+        <w:spacing w:after="80" w:line="276" w:lineRule="auto"/>
         <w:ind w:left="360" w:hanging="360"/>
       </w:pPr>
       <w:r>
@@ -891,12 +885,12 @@
         <w:t xml:space="preserve">PHP 8.2 or higher </w:t>
       </w:r>
       <w:r>
-        <w:t xml:space="preserve">(XAMPP already provides this)</w:t>
-      </w:r>
-    </w:p>
-    <w:p>
-      <w:pPr>
-        <w:spacing w:before="0" w:after="80" w:line="276" w:lineRule="auto"/>
+        <w:t>(XAMPP already provides this)</w:t>
+      </w:r>
+    </w:p>
+    <w:p>
+      <w:pPr>
+        <w:spacing w:after="80" w:line="276" w:lineRule="auto"/>
         <w:ind w:left="360" w:hanging="360"/>
       </w:pPr>
       <w:r>
@@ -913,12 +907,12 @@
         <w:t xml:space="preserve">Composer </w:t>
       </w:r>
       <w:r>
-        <w:t xml:space="preserve">(PHP dependency manager)</w:t>
-      </w:r>
-    </w:p>
-    <w:p>
-      <w:pPr>
-        <w:spacing w:before="0" w:after="80" w:line="276" w:lineRule="auto"/>
+        <w:t>(PHP dependency manager)</w:t>
+      </w:r>
+    </w:p>
+    <w:p>
+      <w:pPr>
+        <w:spacing w:after="80" w:line="276" w:lineRule="auto"/>
         <w:ind w:left="360" w:hanging="360"/>
       </w:pPr>
       <w:r>
@@ -935,12 +929,12 @@
         <w:t xml:space="preserve">Node.js 18+ and npm </w:t>
       </w:r>
       <w:r>
-        <w:t xml:space="preserve">(for compiling front-end assets)</w:t>
-      </w:r>
-    </w:p>
-    <w:p>
-      <w:pPr>
-        <w:spacing w:before="0" w:after="80" w:line="276" w:lineRule="auto"/>
+        <w:t>(for compiling front-end assets)</w:t>
+      </w:r>
+    </w:p>
+    <w:p>
+      <w:pPr>
+        <w:spacing w:after="80" w:line="276" w:lineRule="auto"/>
         <w:ind w:left="360" w:hanging="360"/>
       </w:pPr>
       <w:r>
@@ -957,12 +951,12 @@
         <w:t xml:space="preserve">MySQL </w:t>
       </w:r>
       <w:r>
-        <w:t xml:space="preserve">(bundled with XAMPP) or SQLite</w:t>
-      </w:r>
-    </w:p>
-    <w:p>
-      <w:pPr>
-        <w:spacing w:before="0" w:after="80" w:line="276" w:lineRule="auto"/>
+        <w:t>(bundled with XAMPP) or SQLite</w:t>
+      </w:r>
+    </w:p>
+    <w:p>
+      <w:pPr>
+        <w:spacing w:after="80" w:line="276" w:lineRule="auto"/>
         <w:ind w:left="360" w:hanging="360"/>
       </w:pPr>
       <w:r>
@@ -976,7 +970,7 @@
         <w:rPr>
           <w:b/>
         </w:rPr>
-        <w:t xml:space="preserve">Git</w:t>
+        <w:t>Git</w:t>
       </w:r>
     </w:p>
     <w:p>
@@ -989,42 +983,42 @@
       </w:pPr>
       <w:r>
         <w:rPr>
+          <w:rFonts w:ascii="Calibri Light" w:hAnsi="Calibri Light" w:cs="Calibri Light"/>
           <w:b/>
           <w:color w:val="2F5496"/>
-          <w:rFonts w:ascii="Calibri Light" w:hAnsi="Calibri Light" w:cs="Calibri Light"/>
           <w:sz w:val="32"/>
           <w:szCs w:val="32"/>
         </w:rPr>
-        <w:t xml:space="preserve">4.  Quick Start (Recommended)</w:t>
-      </w:r>
-    </w:p>
-    <w:p>
-      <w:pPr>
-        <w:spacing w:before="0" w:after="160" w:line="276" w:lineRule="auto"/>
+        <w:t>4.  Quick Start (Recommended)</w:t>
+      </w:r>
+    </w:p>
+    <w:p>
+      <w:pPr>
+        <w:spacing w:line="276" w:lineRule="auto"/>
       </w:pPr>
       <w:r>
         <w:t xml:space="preserve">The project ships with a </w:t>
       </w:r>
       <w:r>
         <w:rPr>
-          <w:color w:val="C55A11"/>
-          <w:rFonts w:ascii="Consolas" w:hAnsi="Consolas" w:cs="Consolas"/>
-          <w:sz w:val="19"/>
-          <w:szCs w:val="19"/>
-        </w:rPr>
-        <w:t xml:space="preserve">setup</w:t>
+          <w:rFonts w:ascii="Consolas" w:hAnsi="Consolas" w:cs="Consolas"/>
+          <w:color w:val="C55A11"/>
+          <w:sz w:val="19"/>
+          <w:szCs w:val="19"/>
+        </w:rPr>
+        <w:t>setup</w:t>
       </w:r>
       <w:r>
         <w:t xml:space="preserve"> script in </w:t>
       </w:r>
       <w:r>
         <w:rPr>
-          <w:color w:val="C55A11"/>
-          <w:rFonts w:ascii="Consolas" w:hAnsi="Consolas" w:cs="Consolas"/>
-          <w:sz w:val="19"/>
-          <w:szCs w:val="19"/>
-        </w:rPr>
-        <w:t xml:space="preserve">composer.json</w:t>
+          <w:rFonts w:ascii="Consolas" w:hAnsi="Consolas" w:cs="Consolas"/>
+          <w:color w:val="C55A11"/>
+          <w:sz w:val="19"/>
+          <w:szCs w:val="19"/>
+        </w:rPr>
+        <w:t>composer.json</w:t>
       </w:r>
       <w:r>
         <w:t xml:space="preserve"> that automates the whole process. From the project folder, run:</w:t>
@@ -1032,83 +1026,83 @@
     </w:p>
     <w:p>
       <w:pPr>
+        <w:pBdr>
+          <w:top w:val="single" w:sz="4" w:space="2" w:color="E1E1E1"/>
+          <w:left w:val="single" w:sz="24" w:space="4" w:color="C55A11"/>
+        </w:pBdr>
         <w:shd w:val="clear" w:color="auto" w:fill="F4F4F5"/>
+        <w:spacing w:after="0" w:line="240" w:lineRule="auto"/>
+        <w:ind w:left="120"/>
+      </w:pPr>
+      <w:r>
+        <w:rPr>
+          <w:rFonts w:ascii="Consolas" w:hAnsi="Consolas" w:cs="Consolas"/>
+          <w:color w:val="1F2937"/>
+          <w:sz w:val="19"/>
+          <w:szCs w:val="19"/>
+        </w:rPr>
+        <w:t>git clone &lt;your-repo-url&gt;</w:t>
+      </w:r>
+    </w:p>
+    <w:p>
+      <w:pPr>
         <w:pBdr>
           <w:left w:val="single" w:sz="24" w:space="4" w:color="C55A11"/>
-          <w:top w:val="single" w:sz="4" w:space="2" w:color="E1E1E1"/>
-        </w:pBdr>
-        <w:spacing w:before="0" w:after="0" w:line="240" w:lineRule="auto"/>
+        </w:pBdr>
+        <w:shd w:val="clear" w:color="auto" w:fill="F4F4F5"/>
+        <w:spacing w:after="0" w:line="240" w:lineRule="auto"/>
         <w:ind w:left="120"/>
       </w:pPr>
       <w:r>
         <w:rPr>
+          <w:rFonts w:ascii="Consolas" w:hAnsi="Consolas" w:cs="Consolas"/>
           <w:color w:val="1F2937"/>
-          <w:rFonts w:ascii="Consolas" w:hAnsi="Consolas" w:cs="Consolas"/>
-          <w:sz w:val="19"/>
-          <w:szCs w:val="19"/>
-        </w:rPr>
-        <w:t xml:space="preserve">git clone &lt;your-repo-url&gt;</w:t>
-      </w:r>
-    </w:p>
-    <w:p>
-      <w:pPr>
-        <w:shd w:val="clear" w:color="auto" w:fill="F4F4F5"/>
-        <w:pBdr>
-          <w:left w:val="single" w:sz="24" w:space="4" w:color="C55A11"/>
-        </w:pBdr>
-        <w:spacing w:before="0" w:after="0" w:line="240" w:lineRule="auto"/>
-        <w:ind w:left="120"/>
-      </w:pPr>
-      <w:r>
-        <w:rPr>
-          <w:color w:val="1F2937"/>
-          <w:rFonts w:ascii="Consolas" w:hAnsi="Consolas" w:cs="Consolas"/>
-          <w:sz w:val="19"/>
-          <w:szCs w:val="19"/>
-        </w:rPr>
-        <w:t xml:space="preserve">cd Hotel_Booking_Ops_V5</w:t>
-      </w:r>
-    </w:p>
-    <w:p>
-      <w:pPr>
-        <w:shd w:val="clear" w:color="auto" w:fill="F4F4F5"/>
+          <w:sz w:val="19"/>
+          <w:szCs w:val="19"/>
+        </w:rPr>
+        <w:t>cd Hotel_Booking_Ops</w:t>
+      </w:r>
+    </w:p>
+    <w:p>
+      <w:pPr>
         <w:pBdr>
           <w:left w:val="single" w:sz="24" w:space="4" w:color="C55A11"/>
           <w:bottom w:val="single" w:sz="4" w:space="2" w:color="E1E1E1"/>
         </w:pBdr>
-        <w:spacing w:before="0" w:after="0" w:line="240" w:lineRule="auto"/>
+        <w:shd w:val="clear" w:color="auto" w:fill="F4F4F5"/>
+        <w:spacing w:after="0" w:line="240" w:lineRule="auto"/>
         <w:ind w:left="120"/>
       </w:pPr>
       <w:r>
         <w:rPr>
+          <w:rFonts w:ascii="Consolas" w:hAnsi="Consolas" w:cs="Consolas"/>
           <w:color w:val="1F2937"/>
-          <w:rFonts w:ascii="Consolas" w:hAnsi="Consolas" w:cs="Consolas"/>
-          <w:sz w:val="19"/>
-          <w:szCs w:val="19"/>
-        </w:rPr>
-        <w:t xml:space="preserve">composer setup</w:t>
-      </w:r>
-    </w:p>
-    <w:p>
-      <w:pPr>
-        <w:spacing w:before="0" w:after="120" w:line="120" w:lineRule="auto"/>
-      </w:pPr>
-    </w:p>
-    <w:p>
-      <w:pPr>
-        <w:spacing w:before="0" w:after="160" w:line="276" w:lineRule="auto"/>
+          <w:sz w:val="19"/>
+          <w:szCs w:val="19"/>
+        </w:rPr>
+        <w:t>composer setup</w:t>
+      </w:r>
+    </w:p>
+    <w:p>
+      <w:pPr>
+        <w:spacing w:after="120" w:line="120" w:lineRule="auto"/>
+      </w:pPr>
+    </w:p>
+    <w:p>
+      <w:pPr>
+        <w:spacing w:line="276" w:lineRule="auto"/>
       </w:pPr>
       <w:r>
         <w:t xml:space="preserve">That single </w:t>
       </w:r>
       <w:r>
         <w:rPr>
-          <w:color w:val="C55A11"/>
-          <w:rFonts w:ascii="Consolas" w:hAnsi="Consolas" w:cs="Consolas"/>
-          <w:sz w:val="19"/>
-          <w:szCs w:val="19"/>
-        </w:rPr>
-        <w:t xml:space="preserve">composer setup</w:t>
+          <w:rFonts w:ascii="Consolas" w:hAnsi="Consolas" w:cs="Consolas"/>
+          <w:color w:val="C55A11"/>
+          <w:sz w:val="19"/>
+          <w:szCs w:val="19"/>
+        </w:rPr>
+        <w:t>composer setup</w:t>
       </w:r>
       <w:r>
         <w:t xml:space="preserve"> command performs all of the following in order:</w:t>
@@ -1116,135 +1110,135 @@
     </w:p>
     <w:p>
       <w:pPr>
+        <w:pBdr>
+          <w:top w:val="single" w:sz="4" w:space="2" w:color="E1E1E1"/>
+          <w:left w:val="single" w:sz="24" w:space="4" w:color="C55A11"/>
+        </w:pBdr>
         <w:shd w:val="clear" w:color="auto" w:fill="F4F4F5"/>
+        <w:spacing w:after="0" w:line="240" w:lineRule="auto"/>
+        <w:ind w:left="120"/>
+      </w:pPr>
+      <w:r>
+        <w:rPr>
+          <w:rFonts w:ascii="Consolas" w:hAnsi="Consolas" w:cs="Consolas"/>
+          <w:color w:val="1F2937"/>
+          <w:sz w:val="19"/>
+          <w:szCs w:val="19"/>
+        </w:rPr>
+        <w:t>composer install        # restore PHP dependencies (vendor/)</w:t>
+      </w:r>
+    </w:p>
+    <w:p>
+      <w:pPr>
         <w:pBdr>
           <w:left w:val="single" w:sz="24" w:space="4" w:color="C55A11"/>
-          <w:top w:val="single" w:sz="4" w:space="2" w:color="E1E1E1"/>
-        </w:pBdr>
-        <w:spacing w:before="0" w:after="0" w:line="240" w:lineRule="auto"/>
+        </w:pBdr>
+        <w:shd w:val="clear" w:color="auto" w:fill="F4F4F5"/>
+        <w:spacing w:after="0" w:line="240" w:lineRule="auto"/>
         <w:ind w:left="120"/>
       </w:pPr>
       <w:r>
         <w:rPr>
+          <w:rFonts w:ascii="Consolas" w:hAnsi="Consolas" w:cs="Consolas"/>
           <w:color w:val="1F2937"/>
-          <w:rFonts w:ascii="Consolas" w:hAnsi="Consolas" w:cs="Consolas"/>
-          <w:sz w:val="19"/>
-          <w:szCs w:val="19"/>
-        </w:rPr>
-        <w:t xml:space="preserve">composer install        # restore PHP dependencies (vendor/)</w:t>
-      </w:r>
-    </w:p>
-    <w:p>
-      <w:pPr>
+          <w:sz w:val="19"/>
+          <w:szCs w:val="19"/>
+        </w:rPr>
+        <w:t>copy .env.example .env   # create the environment file</w:t>
+      </w:r>
+    </w:p>
+    <w:p>
+      <w:pPr>
+        <w:pBdr>
+          <w:left w:val="single" w:sz="24" w:space="4" w:color="C55A11"/>
+        </w:pBdr>
         <w:shd w:val="clear" w:color="auto" w:fill="F4F4F5"/>
+        <w:spacing w:after="0" w:line="240" w:lineRule="auto"/>
+        <w:ind w:left="120"/>
+      </w:pPr>
+      <w:r>
+        <w:rPr>
+          <w:rFonts w:ascii="Consolas" w:hAnsi="Consolas" w:cs="Consolas"/>
+          <w:color w:val="1F2937"/>
+          <w:sz w:val="19"/>
+          <w:szCs w:val="19"/>
+        </w:rPr>
+        <w:t>php artisan key:generate # generate the APP_KEY</w:t>
+      </w:r>
+    </w:p>
+    <w:p>
+      <w:pPr>
         <w:pBdr>
           <w:left w:val="single" w:sz="24" w:space="4" w:color="C55A11"/>
         </w:pBdr>
-        <w:spacing w:before="0" w:after="0" w:line="240" w:lineRule="auto"/>
+        <w:shd w:val="clear" w:color="auto" w:fill="F4F4F5"/>
+        <w:spacing w:after="0" w:line="240" w:lineRule="auto"/>
         <w:ind w:left="120"/>
       </w:pPr>
       <w:r>
         <w:rPr>
+          <w:rFonts w:ascii="Consolas" w:hAnsi="Consolas" w:cs="Consolas"/>
           <w:color w:val="1F2937"/>
-          <w:rFonts w:ascii="Consolas" w:hAnsi="Consolas" w:cs="Consolas"/>
-          <w:sz w:val="19"/>
-          <w:szCs w:val="19"/>
-        </w:rPr>
-        <w:t xml:space="preserve">copy .env.example .env   # create the environment file</w:t>
-      </w:r>
-    </w:p>
-    <w:p>
-      <w:pPr>
+          <w:sz w:val="19"/>
+          <w:szCs w:val="19"/>
+        </w:rPr>
+        <w:t>php artisan migrate      # build the database schema</w:t>
+      </w:r>
+    </w:p>
+    <w:p>
+      <w:pPr>
+        <w:pBdr>
+          <w:left w:val="single" w:sz="24" w:space="4" w:color="C55A11"/>
+        </w:pBdr>
         <w:shd w:val="clear" w:color="auto" w:fill="F4F4F5"/>
-        <w:pBdr>
-          <w:left w:val="single" w:sz="24" w:space="4" w:color="C55A11"/>
-        </w:pBdr>
-        <w:spacing w:before="0" w:after="0" w:line="240" w:lineRule="auto"/>
+        <w:spacing w:after="0" w:line="240" w:lineRule="auto"/>
         <w:ind w:left="120"/>
       </w:pPr>
       <w:r>
         <w:rPr>
+          <w:rFonts w:ascii="Consolas" w:hAnsi="Consolas" w:cs="Consolas"/>
           <w:color w:val="1F2937"/>
-          <w:rFonts w:ascii="Consolas" w:hAnsi="Consolas" w:cs="Consolas"/>
-          <w:sz w:val="19"/>
-          <w:szCs w:val="19"/>
-        </w:rPr>
-        <w:t xml:space="preserve">php artisan key:generate # generate the APP_KEY</w:t>
-      </w:r>
-    </w:p>
-    <w:p>
-      <w:pPr>
-        <w:shd w:val="clear" w:color="auto" w:fill="F4F4F5"/>
-        <w:pBdr>
-          <w:left w:val="single" w:sz="24" w:space="4" w:color="C55A11"/>
-        </w:pBdr>
-        <w:spacing w:before="0" w:after="0" w:line="240" w:lineRule="auto"/>
-        <w:ind w:left="120"/>
-      </w:pPr>
-      <w:r>
-        <w:rPr>
-          <w:color w:val="1F2937"/>
-          <w:rFonts w:ascii="Consolas" w:hAnsi="Consolas" w:cs="Consolas"/>
-          <w:sz w:val="19"/>
-          <w:szCs w:val="19"/>
-        </w:rPr>
-        <w:t xml:space="preserve">php artisan migrate      # build the database schema</w:t>
-      </w:r>
-    </w:p>
-    <w:p>
-      <w:pPr>
-        <w:shd w:val="clear" w:color="auto" w:fill="F4F4F5"/>
-        <w:pBdr>
-          <w:left w:val="single" w:sz="24" w:space="4" w:color="C55A11"/>
-        </w:pBdr>
-        <w:spacing w:before="0" w:after="0" w:line="240" w:lineRule="auto"/>
-        <w:ind w:left="120"/>
-      </w:pPr>
-      <w:r>
-        <w:rPr>
-          <w:color w:val="1F2937"/>
-          <w:rFonts w:ascii="Consolas" w:hAnsi="Consolas" w:cs="Consolas"/>
-          <w:sz w:val="19"/>
-          <w:szCs w:val="19"/>
-        </w:rPr>
-        <w:t xml:space="preserve">npm install              # restore JS dependencies (node_modules/)</w:t>
-      </w:r>
-    </w:p>
-    <w:p>
-      <w:pPr>
-        <w:shd w:val="clear" w:color="auto" w:fill="F4F4F5"/>
+          <w:sz w:val="19"/>
+          <w:szCs w:val="19"/>
+        </w:rPr>
+        <w:t>npm install              # restore JS dependencies (node_modules/)</w:t>
+      </w:r>
+    </w:p>
+    <w:p>
+      <w:pPr>
         <w:pBdr>
           <w:left w:val="single" w:sz="24" w:space="4" w:color="C55A11"/>
           <w:bottom w:val="single" w:sz="4" w:space="2" w:color="E1E1E1"/>
         </w:pBdr>
-        <w:spacing w:before="0" w:after="0" w:line="240" w:lineRule="auto"/>
+        <w:shd w:val="clear" w:color="auto" w:fill="F4F4F5"/>
+        <w:spacing w:after="0" w:line="240" w:lineRule="auto"/>
         <w:ind w:left="120"/>
       </w:pPr>
       <w:r>
         <w:rPr>
+          <w:rFonts w:ascii="Consolas" w:hAnsi="Consolas" w:cs="Consolas"/>
           <w:color w:val="1F2937"/>
-          <w:rFonts w:ascii="Consolas" w:hAnsi="Consolas" w:cs="Consolas"/>
-          <w:sz w:val="19"/>
-          <w:szCs w:val="19"/>
-        </w:rPr>
-        <w:t xml:space="preserve">npm run build            # compile assets into public/build/</w:t>
-      </w:r>
-    </w:p>
-    <w:p>
-      <w:pPr>
-        <w:spacing w:before="0" w:after="120" w:line="120" w:lineRule="auto"/>
-      </w:pPr>
-    </w:p>
-    <w:p>
-      <w:pPr>
-        <w:shd w:val="clear" w:color="auto" w:fill="FFF4E5"/>
+          <w:sz w:val="19"/>
+          <w:szCs w:val="19"/>
+        </w:rPr>
+        <w:t>npm run build            # compile assets into public/build/</w:t>
+      </w:r>
+    </w:p>
+    <w:p>
+      <w:pPr>
+        <w:spacing w:after="120" w:line="120" w:lineRule="auto"/>
+      </w:pPr>
+    </w:p>
+    <w:p>
+      <w:pPr>
         <w:pBdr>
           <w:top w:val="single" w:sz="6" w:space="4" w:color="C55A11"/>
           <w:left w:val="single" w:sz="24" w:space="6" w:color="C55A11"/>
           <w:bottom w:val="single" w:sz="6" w:space="4" w:color="C55A11"/>
           <w:right w:val="single" w:sz="6" w:space="4" w:color="C55A11"/>
         </w:pBdr>
-        <w:spacing w:before="120" w:after="160" w:line="276" w:lineRule="auto"/>
+        <w:shd w:val="clear" w:color="auto" w:fill="FFF4E5"/>
+        <w:spacing w:before="120" w:line="276" w:lineRule="auto"/>
         <w:ind w:left="120"/>
       </w:pPr>
       <w:r>
@@ -1259,12 +1253,12 @@
       </w:r>
       <w:r>
         <w:rPr>
-          <w:color w:val="C55A11"/>
-          <w:rFonts w:ascii="Consolas" w:hAnsi="Consolas" w:cs="Consolas"/>
-          <w:sz w:val="19"/>
-          <w:szCs w:val="19"/>
-        </w:rPr>
-        <w:t xml:space="preserve">migrate</w:t>
+          <w:rFonts w:ascii="Consolas" w:hAnsi="Consolas" w:cs="Consolas"/>
+          <w:color w:val="C55A11"/>
+          <w:sz w:val="19"/>
+          <w:szCs w:val="19"/>
+        </w:rPr>
+        <w:t>migrate</w:t>
       </w:r>
       <w:r>
         <w:t xml:space="preserve"> step will fail if the database connection is not set up.</w:t>
@@ -1280,26 +1274,26 @@
       </w:pPr>
       <w:r>
         <w:rPr>
+          <w:rFonts w:ascii="Calibri Light" w:hAnsi="Calibri Light" w:cs="Calibri Light"/>
           <w:b/>
           <w:color w:val="2F5496"/>
-          <w:rFonts w:ascii="Calibri Light" w:hAnsi="Calibri Light" w:cs="Calibri Light"/>
           <w:sz w:val="32"/>
           <w:szCs w:val="32"/>
         </w:rPr>
-        <w:t xml:space="preserve">5.  Manual Setup (Step by Step)</w:t>
-      </w:r>
-    </w:p>
-    <w:p>
-      <w:pPr>
-        <w:spacing w:before="0" w:after="160" w:line="276" w:lineRule="auto"/>
-      </w:pPr>
-      <w:r>
-        <w:t xml:space="preserve">Prefer to run things one at a time, or need to debug a failed step? Run these commands in order from the project root:</w:t>
-      </w:r>
-    </w:p>
-    <w:p>
-      <w:pPr>
-        <w:spacing w:before="0" w:after="80" w:line="276" w:lineRule="auto"/>
+        <w:t>5.  Manual Setup (Step by Step)</w:t>
+      </w:r>
+    </w:p>
+    <w:p>
+      <w:pPr>
+        <w:spacing w:line="276" w:lineRule="auto"/>
+      </w:pPr>
+      <w:r>
+        <w:t>Prefer to run things one at a time, or need to debug a failed step? Run these commands in order from the project root:</w:t>
+      </w:r>
+    </w:p>
+    <w:p>
+      <w:pPr>
+        <w:spacing w:after="80" w:line="276" w:lineRule="auto"/>
         <w:ind w:left="420" w:hanging="420"/>
       </w:pPr>
       <w:r>
@@ -1307,102 +1301,41 @@
           <w:b/>
           <w:color w:val="C55A11"/>
         </w:rPr>
-        <w:t xml:space="preserve">1.  </w:t>
-      </w:r>
-      <w:r>
-        <w:t xml:space="preserve">Install PHP dependencies:</w:t>
-      </w:r>
-    </w:p>
-    <w:p>
-      <w:pPr>
-        <w:shd w:val="clear" w:color="auto" w:fill="F4F4F5"/>
-        <w:pBdr>
-          <w:left w:val="single" w:sz="24" w:space="4" w:color="C55A11"/>
+        <w:t>1.  </w:t>
+      </w:r>
+      <w:r>
+        <w:t>Install PHP dependencies:</w:t>
+      </w:r>
+    </w:p>
+    <w:p>
+      <w:pPr>
+        <w:pBdr>
           <w:top w:val="single" w:sz="4" w:space="2" w:color="E1E1E1"/>
-          <w:bottom w:val="single" w:sz="4" w:space="2" w:color="E1E1E1"/>
-        </w:pBdr>
-        <w:spacing w:before="0" w:after="0" w:line="240" w:lineRule="auto"/>
-        <w:ind w:left="120"/>
-      </w:pPr>
-      <w:r>
-        <w:rPr>
-          <w:color w:val="1F2937"/>
-          <w:rFonts w:ascii="Consolas" w:hAnsi="Consolas" w:cs="Consolas"/>
-          <w:sz w:val="19"/>
-          <w:szCs w:val="19"/>
-        </w:rPr>
-        <w:t xml:space="preserve">composer install</w:t>
-      </w:r>
-    </w:p>
-    <w:p>
-      <w:pPr>
-        <w:spacing w:before="0" w:after="120" w:line="120" w:lineRule="auto"/>
-      </w:pPr>
-    </w:p>
-    <w:p>
-      <w:pPr>
-        <w:spacing w:before="0" w:after="80" w:line="276" w:lineRule="auto"/>
-        <w:ind w:left="420" w:hanging="420"/>
-      </w:pPr>
-      <w:r>
-        <w:rPr>
-          <w:b/>
-          <w:color w:val="C55A11"/>
-        </w:rPr>
-        <w:t xml:space="preserve">2.  </w:t>
-      </w:r>
-      <w:r>
-        <w:t xml:space="preserve">Create your environment file:</w:t>
-      </w:r>
-    </w:p>
-    <w:p>
-      <w:pPr>
-        <w:shd w:val="clear" w:color="auto" w:fill="F4F4F5"/>
-        <w:pBdr>
-          <w:left w:val="single" w:sz="24" w:space="4" w:color="C55A11"/>
-          <w:top w:val="single" w:sz="4" w:space="2" w:color="E1E1E1"/>
-        </w:pBdr>
-        <w:spacing w:before="0" w:after="0" w:line="240" w:lineRule="auto"/>
-        <w:ind w:left="120"/>
-      </w:pPr>
-      <w:r>
-        <w:rPr>
-          <w:color w:val="1F2937"/>
-          <w:rFonts w:ascii="Consolas" w:hAnsi="Consolas" w:cs="Consolas"/>
-          <w:sz w:val="19"/>
-          <w:szCs w:val="19"/>
-        </w:rPr>
-        <w:t xml:space="preserve">copy .env.example .env      # Windows</w:t>
-      </w:r>
-    </w:p>
-    <w:p>
-      <w:pPr>
-        <w:shd w:val="clear" w:color="auto" w:fill="F4F4F5"/>
-        <w:pBdr>
           <w:left w:val="single" w:sz="24" w:space="4" w:color="C55A11"/>
           <w:bottom w:val="single" w:sz="4" w:space="2" w:color="E1E1E1"/>
         </w:pBdr>
-        <w:spacing w:before="0" w:after="0" w:line="240" w:lineRule="auto"/>
+        <w:shd w:val="clear" w:color="auto" w:fill="F4F4F5"/>
+        <w:spacing w:after="0" w:line="240" w:lineRule="auto"/>
         <w:ind w:left="120"/>
       </w:pPr>
       <w:r>
         <w:rPr>
+          <w:rFonts w:ascii="Consolas" w:hAnsi="Consolas" w:cs="Consolas"/>
           <w:color w:val="1F2937"/>
-          <w:rFonts w:ascii="Consolas" w:hAnsi="Consolas" w:cs="Consolas"/>
-          <w:sz w:val="19"/>
-          <w:szCs w:val="19"/>
-        </w:rPr>
-        <w:t xml:space="preserve">cp .env.example .env        # macOS / Linux</w:t>
-      </w:r>
-    </w:p>
-    <w:p>
-      <w:pPr>
-        <w:spacing w:before="0" w:after="120" w:line="120" w:lineRule="auto"/>
-      </w:pPr>
-    </w:p>
-    <w:p>
-      <w:pPr>
-        <w:spacing w:before="0" w:after="80" w:line="276" w:lineRule="auto"/>
+          <w:sz w:val="19"/>
+          <w:szCs w:val="19"/>
+        </w:rPr>
+        <w:t>composer install</w:t>
+      </w:r>
+    </w:p>
+    <w:p>
+      <w:pPr>
+        <w:spacing w:after="120" w:line="120" w:lineRule="auto"/>
+      </w:pPr>
+    </w:p>
+    <w:p>
+      <w:pPr>
+        <w:spacing w:after="80" w:line="276" w:lineRule="auto"/>
         <w:ind w:left="420" w:hanging="420"/>
       </w:pPr>
       <w:r>
@@ -1410,133 +1343,60 @@
           <w:b/>
           <w:color w:val="C55A11"/>
         </w:rPr>
-        <w:t xml:space="preserve">3.  </w:t>
-      </w:r>
-      <w:r>
-        <w:t xml:space="preserve">Generate the application encryption key:</w:t>
-      </w:r>
-    </w:p>
-    <w:p>
-      <w:pPr>
+        <w:t>2.  </w:t>
+      </w:r>
+      <w:r>
+        <w:t>Create your environment file:</w:t>
+      </w:r>
+    </w:p>
+    <w:p>
+      <w:pPr>
+        <w:pBdr>
+          <w:top w:val="single" w:sz="4" w:space="2" w:color="E1E1E1"/>
+          <w:left w:val="single" w:sz="24" w:space="4" w:color="C55A11"/>
+        </w:pBdr>
         <w:shd w:val="clear" w:color="auto" w:fill="F4F4F5"/>
-        <w:pBdr>
-          <w:left w:val="single" w:sz="24" w:space="4" w:color="C55A11"/>
-          <w:top w:val="single" w:sz="4" w:space="2" w:color="E1E1E1"/>
-          <w:bottom w:val="single" w:sz="4" w:space="2" w:color="E1E1E1"/>
-        </w:pBdr>
-        <w:spacing w:before="0" w:after="0" w:line="240" w:lineRule="auto"/>
+        <w:spacing w:after="0" w:line="240" w:lineRule="auto"/>
         <w:ind w:left="120"/>
       </w:pPr>
       <w:r>
         <w:rPr>
+          <w:rFonts w:ascii="Consolas" w:hAnsi="Consolas" w:cs="Consolas"/>
           <w:color w:val="1F2937"/>
-          <w:rFonts w:ascii="Consolas" w:hAnsi="Consolas" w:cs="Consolas"/>
-          <w:sz w:val="19"/>
-          <w:szCs w:val="19"/>
-        </w:rPr>
-        <w:t xml:space="preserve">php artisan key:generate</w:t>
-      </w:r>
-    </w:p>
-    <w:p>
-      <w:pPr>
-        <w:spacing w:before="0" w:after="120" w:line="120" w:lineRule="auto"/>
-      </w:pPr>
-    </w:p>
-    <w:p>
-      <w:pPr>
-        <w:spacing w:before="0" w:after="80" w:line="276" w:lineRule="auto"/>
-        <w:ind w:left="420" w:hanging="420"/>
-      </w:pPr>
-      <w:r>
-        <w:rPr>
-          <w:b/>
-          <w:color w:val="C55A11"/>
-        </w:rPr>
-        <w:t xml:space="preserve">4.  </w:t>
-      </w:r>
-      <w:r>
-        <w:t xml:space="preserve">Configure the database in </w:t>
-      </w:r>
-      <w:r>
-        <w:rPr>
-          <w:color w:val="C55A11"/>
-          <w:rFonts w:ascii="Consolas" w:hAnsi="Consolas" w:cs="Consolas"/>
-          <w:sz w:val="19"/>
-          <w:szCs w:val="19"/>
-        </w:rPr>
-        <w:t xml:space="preserve">.env</w:t>
-      </w:r>
-      <w:r>
-        <w:t xml:space="preserve">, then build the schema:</w:t>
-      </w:r>
-    </w:p>
-    <w:p>
-      <w:pPr>
-        <w:shd w:val="clear" w:color="auto" w:fill="F4F4F5"/>
-        <w:pBdr>
-          <w:left w:val="single" w:sz="24" w:space="4" w:color="C55A11"/>
-          <w:top w:val="single" w:sz="4" w:space="2" w:color="E1E1E1"/>
-        </w:pBdr>
-        <w:spacing w:before="0" w:after="0" w:line="240" w:lineRule="auto"/>
-        <w:ind w:left="120"/>
-      </w:pPr>
-      <w:r>
-        <w:rPr>
-          <w:color w:val="1F2937"/>
-          <w:rFonts w:ascii="Consolas" w:hAnsi="Consolas" w:cs="Consolas"/>
-          <w:sz w:val="19"/>
-          <w:szCs w:val="19"/>
-        </w:rPr>
-        <w:t xml:space="preserve">php artisan migrate</w:t>
-      </w:r>
-    </w:p>
-    <w:p>
-      <w:pPr>
-        <w:shd w:val="clear" w:color="auto" w:fill="F4F4F5"/>
-        <w:pBdr>
-          <w:left w:val="single" w:sz="24" w:space="4" w:color="C55A11"/>
-        </w:pBdr>
-        <w:spacing w:before="0" w:after="0" w:line="240" w:lineRule="auto"/>
-        <w:ind w:left="120"/>
-      </w:pPr>
-      <w:r>
-        <w:rPr>
-          <w:color w:val="1F2937"/>
-          <w:rFonts w:ascii="Consolas" w:hAnsi="Consolas" w:cs="Consolas"/>
-          <w:sz w:val="19"/>
-          <w:szCs w:val="19"/>
-        </w:rPr>
-        <w:t xml:space="preserve"># or, to also load demo/seed data:</w:t>
-      </w:r>
-    </w:p>
-    <w:p>
-      <w:pPr>
-        <w:shd w:val="clear" w:color="auto" w:fill="F4F4F5"/>
+          <w:sz w:val="19"/>
+          <w:szCs w:val="19"/>
+        </w:rPr>
+        <w:t>copy .env.example .env      # Windows</w:t>
+      </w:r>
+    </w:p>
+    <w:p>
+      <w:pPr>
         <w:pBdr>
           <w:left w:val="single" w:sz="24" w:space="4" w:color="C55A11"/>
           <w:bottom w:val="single" w:sz="4" w:space="2" w:color="E1E1E1"/>
         </w:pBdr>
-        <w:spacing w:before="0" w:after="0" w:line="240" w:lineRule="auto"/>
+        <w:shd w:val="clear" w:color="auto" w:fill="F4F4F5"/>
+        <w:spacing w:after="0" w:line="240" w:lineRule="auto"/>
         <w:ind w:left="120"/>
       </w:pPr>
       <w:r>
         <w:rPr>
+          <w:rFonts w:ascii="Consolas" w:hAnsi="Consolas" w:cs="Consolas"/>
           <w:color w:val="1F2937"/>
-          <w:rFonts w:ascii="Consolas" w:hAnsi="Consolas" w:cs="Consolas"/>
-          <w:sz w:val="19"/>
-          <w:szCs w:val="19"/>
-        </w:rPr>
-        <w:t xml:space="preserve">php artisan migrate --seed</w:t>
-      </w:r>
-    </w:p>
-    <w:p>
-      <w:pPr>
-        <w:spacing w:before="0" w:after="120" w:line="120" w:lineRule="auto"/>
-      </w:pPr>
-    </w:p>
-    <w:p>
-      <w:pPr>
-        <w:spacing w:before="0" w:after="80" w:line="276" w:lineRule="auto"/>
+          <w:sz w:val="19"/>
+          <w:szCs w:val="19"/>
+        </w:rPr>
+        <w:t>cp .env.example .env        # macOS / Linux</w:t>
+      </w:r>
+    </w:p>
+    <w:p>
+      <w:pPr>
+        <w:spacing w:after="120" w:line="120" w:lineRule="auto"/>
+      </w:pPr>
+    </w:p>
+    <w:p>
+      <w:pPr>
+        <w:spacing w:after="80" w:line="276" w:lineRule="auto"/>
         <w:ind w:left="420" w:hanging="420"/>
       </w:pPr>
       <w:r>
@@ -1544,60 +1404,42 @@
           <w:b/>
           <w:color w:val="C55A11"/>
         </w:rPr>
-        <w:t xml:space="preserve">5.  </w:t>
-      </w:r>
-      <w:r>
-        <w:t xml:space="preserve">Install and compile front-end assets:</w:t>
-      </w:r>
-    </w:p>
-    <w:p>
-      <w:pPr>
-        <w:shd w:val="clear" w:color="auto" w:fill="F4F4F5"/>
-        <w:pBdr>
-          <w:left w:val="single" w:sz="24" w:space="4" w:color="C55A11"/>
+        <w:t>3.  </w:t>
+      </w:r>
+      <w:r>
+        <w:t>Generate the application encryption key:</w:t>
+      </w:r>
+    </w:p>
+    <w:p>
+      <w:pPr>
+        <w:pBdr>
           <w:top w:val="single" w:sz="4" w:space="2" w:color="E1E1E1"/>
-        </w:pBdr>
-        <w:spacing w:before="0" w:after="0" w:line="240" w:lineRule="auto"/>
-        <w:ind w:left="120"/>
-      </w:pPr>
-      <w:r>
-        <w:rPr>
-          <w:color w:val="1F2937"/>
-          <w:rFonts w:ascii="Consolas" w:hAnsi="Consolas" w:cs="Consolas"/>
-          <w:sz w:val="19"/>
-          <w:szCs w:val="19"/>
-        </w:rPr>
-        <w:t xml:space="preserve">npm install</w:t>
-      </w:r>
-    </w:p>
-    <w:p>
-      <w:pPr>
-        <w:shd w:val="clear" w:color="auto" w:fill="F4F4F5"/>
-        <w:pBdr>
           <w:left w:val="single" w:sz="24" w:space="4" w:color="C55A11"/>
           <w:bottom w:val="single" w:sz="4" w:space="2" w:color="E1E1E1"/>
         </w:pBdr>
-        <w:spacing w:before="0" w:after="0" w:line="240" w:lineRule="auto"/>
+        <w:shd w:val="clear" w:color="auto" w:fill="F4F4F5"/>
+        <w:spacing w:after="0" w:line="240" w:lineRule="auto"/>
         <w:ind w:left="120"/>
       </w:pPr>
       <w:r>
         <w:rPr>
+          <w:rFonts w:ascii="Consolas" w:hAnsi="Consolas" w:cs="Consolas"/>
           <w:color w:val="1F2937"/>
-          <w:rFonts w:ascii="Consolas" w:hAnsi="Consolas" w:cs="Consolas"/>
-          <w:sz w:val="19"/>
-          <w:szCs w:val="19"/>
-        </w:rPr>
-        <w:t xml:space="preserve">npm run build</w:t>
-      </w:r>
-    </w:p>
-    <w:p>
-      <w:pPr>
-        <w:spacing w:before="0" w:after="120" w:line="120" w:lineRule="auto"/>
-      </w:pPr>
-    </w:p>
-    <w:p>
-      <w:pPr>
-        <w:spacing w:before="0" w:after="80" w:line="276" w:lineRule="auto"/>
+          <w:sz w:val="19"/>
+          <w:szCs w:val="19"/>
+        </w:rPr>
+        <w:lastRenderedPageBreak/>
+        <w:t>php artisan key:generate</w:t>
+      </w:r>
+    </w:p>
+    <w:p>
+      <w:pPr>
+        <w:spacing w:after="120" w:line="120" w:lineRule="auto"/>
+      </w:pPr>
+    </w:p>
+    <w:p>
+      <w:pPr>
+        <w:spacing w:after="80" w:line="276" w:lineRule="auto"/>
         <w:ind w:left="420" w:hanging="420"/>
       </w:pPr>
       <w:r>
@@ -1605,36 +1447,189 @@
           <w:b/>
           <w:color w:val="C55A11"/>
         </w:rPr>
-        <w:t xml:space="preserve">6.  </w:t>
-      </w:r>
-      <w:r>
-        <w:t xml:space="preserve">Link the public storage folder (for uploaded images, etc.):</w:t>
-      </w:r>
-    </w:p>
-    <w:p>
-      <w:pPr>
+        <w:t>4.  </w:t>
+      </w:r>
+      <w:r>
+        <w:t xml:space="preserve">Configure the database in </w:t>
+      </w:r>
+      <w:r>
+        <w:rPr>
+          <w:rFonts w:ascii="Consolas" w:hAnsi="Consolas" w:cs="Consolas"/>
+          <w:color w:val="C55A11"/>
+          <w:sz w:val="19"/>
+          <w:szCs w:val="19"/>
+        </w:rPr>
+        <w:t>.env</w:t>
+      </w:r>
+      <w:r>
+        <w:t>, then build the schema:</w:t>
+      </w:r>
+    </w:p>
+    <w:p>
+      <w:pPr>
+        <w:pBdr>
+          <w:top w:val="single" w:sz="4" w:space="2" w:color="E1E1E1"/>
+          <w:left w:val="single" w:sz="24" w:space="4" w:color="C55A11"/>
+        </w:pBdr>
         <w:shd w:val="clear" w:color="auto" w:fill="F4F4F5"/>
+        <w:spacing w:after="0" w:line="240" w:lineRule="auto"/>
+        <w:ind w:left="120"/>
+      </w:pPr>
+      <w:r>
+        <w:rPr>
+          <w:rFonts w:ascii="Consolas" w:hAnsi="Consolas" w:cs="Consolas"/>
+          <w:color w:val="1F2937"/>
+          <w:sz w:val="19"/>
+          <w:szCs w:val="19"/>
+        </w:rPr>
+        <w:t>php artisan migrate</w:t>
+      </w:r>
+    </w:p>
+    <w:p>
+      <w:pPr>
         <w:pBdr>
           <w:left w:val="single" w:sz="24" w:space="4" w:color="C55A11"/>
+        </w:pBdr>
+        <w:shd w:val="clear" w:color="auto" w:fill="F4F4F5"/>
+        <w:spacing w:after="0" w:line="240" w:lineRule="auto"/>
+        <w:ind w:left="120"/>
+      </w:pPr>
+      <w:r>
+        <w:rPr>
+          <w:rFonts w:ascii="Consolas" w:hAnsi="Consolas" w:cs="Consolas"/>
+          <w:color w:val="1F2937"/>
+          <w:sz w:val="19"/>
+          <w:szCs w:val="19"/>
+        </w:rPr>
+        <w:t># or, to also load demo/seed data:</w:t>
+      </w:r>
+    </w:p>
+    <w:p>
+      <w:pPr>
+        <w:pBdr>
+          <w:left w:val="single" w:sz="24" w:space="4" w:color="C55A11"/>
+          <w:bottom w:val="single" w:sz="4" w:space="2" w:color="E1E1E1"/>
+        </w:pBdr>
+        <w:shd w:val="clear" w:color="auto" w:fill="F4F4F5"/>
+        <w:spacing w:after="0" w:line="240" w:lineRule="auto"/>
+        <w:ind w:left="120"/>
+      </w:pPr>
+      <w:r>
+        <w:rPr>
+          <w:rFonts w:ascii="Consolas" w:hAnsi="Consolas" w:cs="Consolas"/>
+          <w:color w:val="1F2937"/>
+          <w:sz w:val="19"/>
+          <w:szCs w:val="19"/>
+        </w:rPr>
+        <w:t>php artisan migrate --seed</w:t>
+      </w:r>
+    </w:p>
+    <w:p>
+      <w:pPr>
+        <w:spacing w:after="120" w:line="120" w:lineRule="auto"/>
+      </w:pPr>
+    </w:p>
+    <w:p>
+      <w:pPr>
+        <w:spacing w:after="80" w:line="276" w:lineRule="auto"/>
+        <w:ind w:left="420" w:hanging="420"/>
+      </w:pPr>
+      <w:r>
+        <w:rPr>
+          <w:b/>
+          <w:color w:val="C55A11"/>
+        </w:rPr>
+        <w:t>5.  </w:t>
+      </w:r>
+      <w:r>
+        <w:t>Install and compile front-end assets:</w:t>
+      </w:r>
+    </w:p>
+    <w:p>
+      <w:pPr>
+        <w:pBdr>
           <w:top w:val="single" w:sz="4" w:space="2" w:color="E1E1E1"/>
+          <w:left w:val="single" w:sz="24" w:space="4" w:color="C55A11"/>
+        </w:pBdr>
+        <w:shd w:val="clear" w:color="auto" w:fill="F4F4F5"/>
+        <w:spacing w:after="0" w:line="240" w:lineRule="auto"/>
+        <w:ind w:left="120"/>
+      </w:pPr>
+      <w:r>
+        <w:rPr>
+          <w:rFonts w:ascii="Consolas" w:hAnsi="Consolas" w:cs="Consolas"/>
+          <w:color w:val="1F2937"/>
+          <w:sz w:val="19"/>
+          <w:szCs w:val="19"/>
+        </w:rPr>
+        <w:t>npm install</w:t>
+      </w:r>
+    </w:p>
+    <w:p>
+      <w:pPr>
+        <w:pBdr>
+          <w:left w:val="single" w:sz="24" w:space="4" w:color="C55A11"/>
           <w:bottom w:val="single" w:sz="4" w:space="2" w:color="E1E1E1"/>
         </w:pBdr>
-        <w:spacing w:before="0" w:after="0" w:line="240" w:lineRule="auto"/>
+        <w:shd w:val="clear" w:color="auto" w:fill="F4F4F5"/>
+        <w:spacing w:after="0" w:line="240" w:lineRule="auto"/>
         <w:ind w:left="120"/>
       </w:pPr>
       <w:r>
         <w:rPr>
+          <w:rFonts w:ascii="Consolas" w:hAnsi="Consolas" w:cs="Consolas"/>
           <w:color w:val="1F2937"/>
-          <w:rFonts w:ascii="Consolas" w:hAnsi="Consolas" w:cs="Consolas"/>
-          <w:sz w:val="19"/>
-          <w:szCs w:val="19"/>
-        </w:rPr>
-        <w:t xml:space="preserve">php artisan storage:link</w:t>
-      </w:r>
-    </w:p>
-    <w:p>
-      <w:pPr>
-        <w:spacing w:before="0" w:after="120" w:line="120" w:lineRule="auto"/>
+          <w:sz w:val="19"/>
+          <w:szCs w:val="19"/>
+        </w:rPr>
+        <w:t>npm run build</w:t>
+      </w:r>
+    </w:p>
+    <w:p>
+      <w:pPr>
+        <w:spacing w:after="120" w:line="120" w:lineRule="auto"/>
+      </w:pPr>
+    </w:p>
+    <w:p>
+      <w:pPr>
+        <w:spacing w:after="80" w:line="276" w:lineRule="auto"/>
+        <w:ind w:left="420" w:hanging="420"/>
+      </w:pPr>
+      <w:r>
+        <w:rPr>
+          <w:b/>
+          <w:color w:val="C55A11"/>
+        </w:rPr>
+        <w:t>6.  </w:t>
+      </w:r>
+      <w:r>
+        <w:t>Link the public storage folder (for uploaded images, etc.):</w:t>
+      </w:r>
+    </w:p>
+    <w:p>
+      <w:pPr>
+        <w:pBdr>
+          <w:top w:val="single" w:sz="4" w:space="2" w:color="E1E1E1"/>
+          <w:left w:val="single" w:sz="24" w:space="4" w:color="C55A11"/>
+          <w:bottom w:val="single" w:sz="4" w:space="2" w:color="E1E1E1"/>
+        </w:pBdr>
+        <w:shd w:val="clear" w:color="auto" w:fill="F4F4F5"/>
+        <w:spacing w:after="0" w:line="240" w:lineRule="auto"/>
+        <w:ind w:left="120"/>
+      </w:pPr>
+      <w:r>
+        <w:rPr>
+          <w:rFonts w:ascii="Consolas" w:hAnsi="Consolas" w:cs="Consolas"/>
+          <w:color w:val="1F2937"/>
+          <w:sz w:val="19"/>
+          <w:szCs w:val="19"/>
+        </w:rPr>
+        <w:t>php artisan storage:link</w:t>
+      </w:r>
+    </w:p>
+    <w:p>
+      <w:pPr>
+        <w:spacing w:after="120" w:line="120" w:lineRule="auto"/>
       </w:pPr>
     </w:p>
     <w:p>
@@ -1647,30 +1642,30 @@
       </w:pPr>
       <w:r>
         <w:rPr>
+          <w:rFonts w:ascii="Calibri Light" w:hAnsi="Calibri Light" w:cs="Calibri Light"/>
           <w:b/>
           <w:color w:val="2F5496"/>
-          <w:rFonts w:ascii="Calibri Light" w:hAnsi="Calibri Light" w:cs="Calibri Light"/>
           <w:sz w:val="32"/>
           <w:szCs w:val="32"/>
         </w:rPr>
-        <w:t xml:space="preserve">6.  Database Configuration</w:t>
-      </w:r>
-    </w:p>
-    <w:p>
-      <w:pPr>
-        <w:spacing w:before="0" w:after="160" w:line="276" w:lineRule="auto"/>
+        <w:t>6.  Database Configuration</w:t>
+      </w:r>
+    </w:p>
+    <w:p>
+      <w:pPr>
+        <w:spacing w:line="276" w:lineRule="auto"/>
       </w:pPr>
       <w:r>
         <w:t xml:space="preserve">Open the </w:t>
       </w:r>
       <w:r>
         <w:rPr>
-          <w:color w:val="C55A11"/>
-          <w:rFonts w:ascii="Consolas" w:hAnsi="Consolas" w:cs="Consolas"/>
-          <w:sz w:val="19"/>
-          <w:szCs w:val="19"/>
-        </w:rPr>
-        <w:t xml:space="preserve">.env</w:t>
+          <w:rFonts w:ascii="Consolas" w:hAnsi="Consolas" w:cs="Consolas"/>
+          <w:color w:val="C55A11"/>
+          <w:sz w:val="19"/>
+          <w:szCs w:val="19"/>
+        </w:rPr>
+        <w:t>.env</w:t>
       </w:r>
       <w:r>
         <w:t xml:space="preserve"> file and set your database connection. For a typical XAMPP / MySQL setup, create an empty database in phpMyAdmin first, then set:</w:t>
@@ -1678,152 +1673,152 @@
     </w:p>
     <w:p>
       <w:pPr>
+        <w:pBdr>
+          <w:top w:val="single" w:sz="4" w:space="2" w:color="E1E1E1"/>
+          <w:left w:val="single" w:sz="24" w:space="4" w:color="C55A11"/>
+        </w:pBdr>
         <w:shd w:val="clear" w:color="auto" w:fill="F4F4F5"/>
+        <w:spacing w:after="0" w:line="240" w:lineRule="auto"/>
+        <w:ind w:left="120"/>
+      </w:pPr>
+      <w:r>
+        <w:rPr>
+          <w:rFonts w:ascii="Consolas" w:hAnsi="Consolas" w:cs="Consolas"/>
+          <w:color w:val="1F2937"/>
+          <w:sz w:val="19"/>
+          <w:szCs w:val="19"/>
+        </w:rPr>
+        <w:t>DB_CONNECTION=mysql</w:t>
+      </w:r>
+    </w:p>
+    <w:p>
+      <w:pPr>
         <w:pBdr>
           <w:left w:val="single" w:sz="24" w:space="4" w:color="C55A11"/>
-          <w:top w:val="single" w:sz="4" w:space="2" w:color="E1E1E1"/>
-        </w:pBdr>
-        <w:spacing w:before="0" w:after="0" w:line="240" w:lineRule="auto"/>
+        </w:pBdr>
+        <w:shd w:val="clear" w:color="auto" w:fill="F4F4F5"/>
+        <w:spacing w:after="0" w:line="240" w:lineRule="auto"/>
         <w:ind w:left="120"/>
       </w:pPr>
       <w:r>
         <w:rPr>
+          <w:rFonts w:ascii="Consolas" w:hAnsi="Consolas" w:cs="Consolas"/>
           <w:color w:val="1F2937"/>
-          <w:rFonts w:ascii="Consolas" w:hAnsi="Consolas" w:cs="Consolas"/>
-          <w:sz w:val="19"/>
-          <w:szCs w:val="19"/>
-        </w:rPr>
-        <w:t xml:space="preserve">DB_CONNECTION=mysql</w:t>
-      </w:r>
-    </w:p>
-    <w:p>
-      <w:pPr>
+          <w:sz w:val="19"/>
+          <w:szCs w:val="19"/>
+        </w:rPr>
+        <w:t>DB_HOST=127.0.0.1</w:t>
+      </w:r>
+    </w:p>
+    <w:p>
+      <w:pPr>
+        <w:pBdr>
+          <w:left w:val="single" w:sz="24" w:space="4" w:color="C55A11"/>
+        </w:pBdr>
         <w:shd w:val="clear" w:color="auto" w:fill="F4F4F5"/>
+        <w:spacing w:after="0" w:line="240" w:lineRule="auto"/>
+        <w:ind w:left="120"/>
+      </w:pPr>
+      <w:r>
+        <w:rPr>
+          <w:rFonts w:ascii="Consolas" w:hAnsi="Consolas" w:cs="Consolas"/>
+          <w:color w:val="1F2937"/>
+          <w:sz w:val="19"/>
+          <w:szCs w:val="19"/>
+        </w:rPr>
+        <w:t>DB_PORT=3306</w:t>
+      </w:r>
+    </w:p>
+    <w:p>
+      <w:pPr>
         <w:pBdr>
           <w:left w:val="single" w:sz="24" w:space="4" w:color="C55A11"/>
         </w:pBdr>
-        <w:spacing w:before="0" w:after="0" w:line="240" w:lineRule="auto"/>
+        <w:shd w:val="clear" w:color="auto" w:fill="F4F4F5"/>
+        <w:spacing w:after="0" w:line="240" w:lineRule="auto"/>
         <w:ind w:left="120"/>
       </w:pPr>
       <w:r>
         <w:rPr>
+          <w:rFonts w:ascii="Consolas" w:hAnsi="Consolas" w:cs="Consolas"/>
           <w:color w:val="1F2937"/>
-          <w:rFonts w:ascii="Consolas" w:hAnsi="Consolas" w:cs="Consolas"/>
-          <w:sz w:val="19"/>
-          <w:szCs w:val="19"/>
-        </w:rPr>
-        <w:t xml:space="preserve">DB_HOST=127.0.0.1</w:t>
-      </w:r>
-    </w:p>
-    <w:p>
-      <w:pPr>
+          <w:sz w:val="19"/>
+          <w:szCs w:val="19"/>
+        </w:rPr>
+        <w:t>DB_DATABASE=hotel_booking_ops</w:t>
+      </w:r>
+    </w:p>
+    <w:p>
+      <w:pPr>
+        <w:pBdr>
+          <w:left w:val="single" w:sz="24" w:space="4" w:color="C55A11"/>
+        </w:pBdr>
         <w:shd w:val="clear" w:color="auto" w:fill="F4F4F5"/>
-        <w:pBdr>
-          <w:left w:val="single" w:sz="24" w:space="4" w:color="C55A11"/>
-        </w:pBdr>
-        <w:spacing w:before="0" w:after="0" w:line="240" w:lineRule="auto"/>
+        <w:spacing w:after="0" w:line="240" w:lineRule="auto"/>
         <w:ind w:left="120"/>
       </w:pPr>
       <w:r>
         <w:rPr>
+          <w:rFonts w:ascii="Consolas" w:hAnsi="Consolas" w:cs="Consolas"/>
           <w:color w:val="1F2937"/>
-          <w:rFonts w:ascii="Consolas" w:hAnsi="Consolas" w:cs="Consolas"/>
-          <w:sz w:val="19"/>
-          <w:szCs w:val="19"/>
-        </w:rPr>
-        <w:t xml:space="preserve">DB_PORT=3306</w:t>
-      </w:r>
-    </w:p>
-    <w:p>
-      <w:pPr>
-        <w:shd w:val="clear" w:color="auto" w:fill="F4F4F5"/>
-        <w:pBdr>
-          <w:left w:val="single" w:sz="24" w:space="4" w:color="C55A11"/>
-        </w:pBdr>
-        <w:spacing w:before="0" w:after="0" w:line="240" w:lineRule="auto"/>
-        <w:ind w:left="120"/>
-      </w:pPr>
-      <w:r>
-        <w:rPr>
-          <w:color w:val="1F2937"/>
-          <w:rFonts w:ascii="Consolas" w:hAnsi="Consolas" w:cs="Consolas"/>
-          <w:sz w:val="19"/>
-          <w:szCs w:val="19"/>
-        </w:rPr>
-        <w:t xml:space="preserve">DB_DATABASE=hotel_booking_ops</w:t>
-      </w:r>
-    </w:p>
-    <w:p>
-      <w:pPr>
-        <w:shd w:val="clear" w:color="auto" w:fill="F4F4F5"/>
-        <w:pBdr>
-          <w:left w:val="single" w:sz="24" w:space="4" w:color="C55A11"/>
-        </w:pBdr>
-        <w:spacing w:before="0" w:after="0" w:line="240" w:lineRule="auto"/>
-        <w:ind w:left="120"/>
-      </w:pPr>
-      <w:r>
-        <w:rPr>
-          <w:color w:val="1F2937"/>
-          <w:rFonts w:ascii="Consolas" w:hAnsi="Consolas" w:cs="Consolas"/>
-          <w:sz w:val="19"/>
-          <w:szCs w:val="19"/>
-        </w:rPr>
-        <w:t xml:space="preserve">DB_USERNAME=root</w:t>
-      </w:r>
-    </w:p>
-    <w:p>
-      <w:pPr>
-        <w:shd w:val="clear" w:color="auto" w:fill="F4F4F5"/>
+          <w:sz w:val="19"/>
+          <w:szCs w:val="19"/>
+        </w:rPr>
+        <w:t>DB_USERNAME=root</w:t>
+      </w:r>
+    </w:p>
+    <w:p>
+      <w:pPr>
         <w:pBdr>
           <w:left w:val="single" w:sz="24" w:space="4" w:color="C55A11"/>
           <w:bottom w:val="single" w:sz="4" w:space="2" w:color="E1E1E1"/>
         </w:pBdr>
-        <w:spacing w:before="0" w:after="0" w:line="240" w:lineRule="auto"/>
+        <w:shd w:val="clear" w:color="auto" w:fill="F4F4F5"/>
+        <w:spacing w:after="0" w:line="240" w:lineRule="auto"/>
         <w:ind w:left="120"/>
       </w:pPr>
       <w:r>
         <w:rPr>
+          <w:rFonts w:ascii="Consolas" w:hAnsi="Consolas" w:cs="Consolas"/>
           <w:color w:val="1F2937"/>
-          <w:rFonts w:ascii="Consolas" w:hAnsi="Consolas" w:cs="Consolas"/>
-          <w:sz w:val="19"/>
-          <w:szCs w:val="19"/>
-        </w:rPr>
-        <w:t xml:space="preserve">DB_PASSWORD=</w:t>
-      </w:r>
-    </w:p>
-    <w:p>
-      <w:pPr>
-        <w:spacing w:before="0" w:after="120" w:line="120" w:lineRule="auto"/>
-      </w:pPr>
-    </w:p>
-    <w:p>
-      <w:pPr>
-        <w:spacing w:before="0" w:after="160" w:line="276" w:lineRule="auto"/>
+          <w:sz w:val="19"/>
+          <w:szCs w:val="19"/>
+        </w:rPr>
+        <w:t>DB_PASSWORD=</w:t>
+      </w:r>
+    </w:p>
+    <w:p>
+      <w:pPr>
+        <w:spacing w:after="120" w:line="120" w:lineRule="auto"/>
+      </w:pPr>
+    </w:p>
+    <w:p>
+      <w:pPr>
+        <w:spacing w:line="276" w:lineRule="auto"/>
       </w:pPr>
       <w:r>
         <w:t xml:space="preserve">If you prefer </w:t>
       </w:r>
       <w:r>
         <w:rPr>
-          <w:color w:val="C55A11"/>
-          <w:rFonts w:ascii="Consolas" w:hAnsi="Consolas" w:cs="Consolas"/>
-          <w:sz w:val="19"/>
-          <w:szCs w:val="19"/>
-        </w:rPr>
-        <w:t xml:space="preserve">SQLite</w:t>
+          <w:rFonts w:ascii="Consolas" w:hAnsi="Consolas" w:cs="Consolas"/>
+          <w:color w:val="C55A11"/>
+          <w:sz w:val="19"/>
+          <w:szCs w:val="19"/>
+        </w:rPr>
+        <w:t>SQLite</w:t>
       </w:r>
       <w:r>
         <w:t xml:space="preserve"> (no server needed), set </w:t>
       </w:r>
       <w:r>
         <w:rPr>
-          <w:color w:val="C55A11"/>
-          <w:rFonts w:ascii="Consolas" w:hAnsi="Consolas" w:cs="Consolas"/>
-          <w:sz w:val="19"/>
-          <w:szCs w:val="19"/>
-        </w:rPr>
-        <w:t xml:space="preserve">DB_CONNECTION=sqlite</w:t>
+          <w:rFonts w:ascii="Consolas" w:hAnsi="Consolas" w:cs="Consolas"/>
+          <w:color w:val="C55A11"/>
+          <w:sz w:val="19"/>
+          <w:szCs w:val="19"/>
+        </w:rPr>
+        <w:t>DB_CONNECTION=sqlite</w:t>
       </w:r>
       <w:r>
         <w:t xml:space="preserve"> and create the database file:</w:t>
@@ -1831,47 +1826,47 @@
     </w:p>
     <w:p>
       <w:pPr>
+        <w:pBdr>
+          <w:top w:val="single" w:sz="4" w:space="2" w:color="E1E1E1"/>
+          <w:left w:val="single" w:sz="24" w:space="4" w:color="C55A11"/>
+        </w:pBdr>
         <w:shd w:val="clear" w:color="auto" w:fill="F4F4F5"/>
-        <w:pBdr>
-          <w:left w:val="single" w:sz="24" w:space="4" w:color="C55A11"/>
-          <w:top w:val="single" w:sz="4" w:space="2" w:color="E1E1E1"/>
-        </w:pBdr>
-        <w:spacing w:before="0" w:after="0" w:line="240" w:lineRule="auto"/>
+        <w:spacing w:after="0" w:line="240" w:lineRule="auto"/>
         <w:ind w:left="120"/>
       </w:pPr>
       <w:r>
         <w:rPr>
+          <w:rFonts w:ascii="Consolas" w:hAnsi="Consolas" w:cs="Consolas"/>
           <w:color w:val="1F2937"/>
-          <w:rFonts w:ascii="Consolas" w:hAnsi="Consolas" w:cs="Consolas"/>
-          <w:sz w:val="19"/>
-          <w:szCs w:val="19"/>
-        </w:rPr>
-        <w:t xml:space="preserve">type nul &gt; database\database.sqlite   # Windows</w:t>
-      </w:r>
-    </w:p>
-    <w:p>
-      <w:pPr>
-        <w:shd w:val="clear" w:color="auto" w:fill="F4F4F5"/>
+          <w:sz w:val="19"/>
+          <w:szCs w:val="19"/>
+        </w:rPr>
+        <w:t>type nul &gt; database\database.sqlite   # Windows</w:t>
+      </w:r>
+    </w:p>
+    <w:p>
+      <w:pPr>
         <w:pBdr>
           <w:left w:val="single" w:sz="24" w:space="4" w:color="C55A11"/>
           <w:bottom w:val="single" w:sz="4" w:space="2" w:color="E1E1E1"/>
         </w:pBdr>
-        <w:spacing w:before="0" w:after="0" w:line="240" w:lineRule="auto"/>
+        <w:shd w:val="clear" w:color="auto" w:fill="F4F4F5"/>
+        <w:spacing w:after="0" w:line="240" w:lineRule="auto"/>
         <w:ind w:left="120"/>
       </w:pPr>
       <w:r>
         <w:rPr>
+          <w:rFonts w:ascii="Consolas" w:hAnsi="Consolas" w:cs="Consolas"/>
           <w:color w:val="1F2937"/>
-          <w:rFonts w:ascii="Consolas" w:hAnsi="Consolas" w:cs="Consolas"/>
-          <w:sz w:val="19"/>
-          <w:szCs w:val="19"/>
-        </w:rPr>
-        <w:t xml:space="preserve">touch database/database.sqlite          # macOS / Linux</w:t>
-      </w:r>
-    </w:p>
-    <w:p>
-      <w:pPr>
-        <w:spacing w:before="0" w:after="120" w:line="120" w:lineRule="auto"/>
+          <w:sz w:val="19"/>
+          <w:szCs w:val="19"/>
+        </w:rPr>
+        <w:t>touch database/database.sqlite          # macOS / Linux</w:t>
+      </w:r>
+    </w:p>
+    <w:p>
+      <w:pPr>
+        <w:spacing w:after="120" w:line="120" w:lineRule="auto"/>
       </w:pPr>
     </w:p>
     <w:p>
@@ -1884,30 +1879,30 @@
       </w:pPr>
       <w:r>
         <w:rPr>
+          <w:rFonts w:ascii="Calibri Light" w:hAnsi="Calibri Light" w:cs="Calibri Light"/>
           <w:b/>
           <w:color w:val="2F5496"/>
-          <w:rFonts w:ascii="Calibri Light" w:hAnsi="Calibri Light" w:cs="Calibri Light"/>
           <w:sz w:val="32"/>
           <w:szCs w:val="32"/>
         </w:rPr>
-        <w:t xml:space="preserve">7.  Running the App Day to Day</w:t>
-      </w:r>
-    </w:p>
-    <w:p>
-      <w:pPr>
-        <w:spacing w:before="0" w:after="160" w:line="276" w:lineRule="auto"/>
+        <w:t>7.  Running the App Day to Day</w:t>
+      </w:r>
+    </w:p>
+    <w:p>
+      <w:pPr>
+        <w:spacing w:line="276" w:lineRule="auto"/>
       </w:pPr>
       <w:r>
         <w:t xml:space="preserve">A convenience </w:t>
       </w:r>
       <w:r>
         <w:rPr>
-          <w:color w:val="C55A11"/>
-          <w:rFonts w:ascii="Consolas" w:hAnsi="Consolas" w:cs="Consolas"/>
-          <w:sz w:val="19"/>
-          <w:szCs w:val="19"/>
-        </w:rPr>
-        <w:t xml:space="preserve">dev</w:t>
+          <w:rFonts w:ascii="Consolas" w:hAnsi="Consolas" w:cs="Consolas"/>
+          <w:color w:val="C55A11"/>
+          <w:sz w:val="19"/>
+          <w:szCs w:val="19"/>
+        </w:rPr>
+        <w:t>dev</w:t>
       </w:r>
       <w:r>
         <w:t xml:space="preserve"> script runs the PHP server, queue worker, and Vite dev server together:</w:t>
@@ -1915,41 +1910,41 @@
     </w:p>
     <w:p>
       <w:pPr>
+        <w:pBdr>
+          <w:top w:val="single" w:sz="4" w:space="2" w:color="E1E1E1"/>
+          <w:left w:val="single" w:sz="24" w:space="4" w:color="C55A11"/>
+          <w:bottom w:val="single" w:sz="4" w:space="2" w:color="E1E1E1"/>
+        </w:pBdr>
         <w:shd w:val="clear" w:color="auto" w:fill="F4F4F5"/>
-        <w:pBdr>
-          <w:left w:val="single" w:sz="24" w:space="4" w:color="C55A11"/>
-          <w:top w:val="single" w:sz="4" w:space="2" w:color="E1E1E1"/>
-          <w:bottom w:val="single" w:sz="4" w:space="2" w:color="E1E1E1"/>
-        </w:pBdr>
-        <w:spacing w:before="0" w:after="0" w:line="240" w:lineRule="auto"/>
+        <w:spacing w:after="0" w:line="240" w:lineRule="auto"/>
         <w:ind w:left="120"/>
       </w:pPr>
       <w:r>
         <w:rPr>
+          <w:rFonts w:ascii="Consolas" w:hAnsi="Consolas" w:cs="Consolas"/>
           <w:color w:val="1F2937"/>
-          <w:rFonts w:ascii="Consolas" w:hAnsi="Consolas" w:cs="Consolas"/>
-          <w:sz w:val="19"/>
-          <w:szCs w:val="19"/>
-        </w:rPr>
-        <w:t xml:space="preserve">composer dev</w:t>
-      </w:r>
-    </w:p>
-    <w:p>
-      <w:pPr>
-        <w:spacing w:before="0" w:after="120" w:line="120" w:lineRule="auto"/>
-      </w:pPr>
-    </w:p>
-    <w:p>
-      <w:pPr>
-        <w:spacing w:before="0" w:after="160" w:line="276" w:lineRule="auto"/>
-      </w:pPr>
-      <w:r>
-        <w:t xml:space="preserve">Or start pieces individually:</w:t>
-      </w:r>
-    </w:p>
-    <w:p>
-      <w:pPr>
-        <w:spacing w:before="0" w:after="80" w:line="276" w:lineRule="auto"/>
+          <w:sz w:val="19"/>
+          <w:szCs w:val="19"/>
+        </w:rPr>
+        <w:t>composer dev</w:t>
+      </w:r>
+    </w:p>
+    <w:p>
+      <w:pPr>
+        <w:spacing w:after="120" w:line="120" w:lineRule="auto"/>
+      </w:pPr>
+    </w:p>
+    <w:p>
+      <w:pPr>
+        <w:spacing w:line="276" w:lineRule="auto"/>
+      </w:pPr>
+      <w:r>
+        <w:t>Or start pieces individually:</w:t>
+      </w:r>
+    </w:p>
+    <w:p>
+      <w:pPr>
+        <w:spacing w:after="80" w:line="276" w:lineRule="auto"/>
         <w:ind w:left="360" w:hanging="360"/>
       </w:pPr>
       <w:r>
@@ -1961,12 +1956,12 @@
       </w:r>
       <w:r>
         <w:rPr>
-          <w:color w:val="C55A11"/>
-          <w:rFonts w:ascii="Consolas" w:hAnsi="Consolas" w:cs="Consolas"/>
-          <w:sz w:val="19"/>
-          <w:szCs w:val="19"/>
-        </w:rPr>
-        <w:t xml:space="preserve">php artisan serve</w:t>
+          <w:rFonts w:ascii="Consolas" w:hAnsi="Consolas" w:cs="Consolas"/>
+          <w:color w:val="C55A11"/>
+          <w:sz w:val="19"/>
+          <w:szCs w:val="19"/>
+        </w:rPr>
+        <w:t>php artisan serve</w:t>
       </w:r>
       <w:r>
         <w:t xml:space="preserve">  — start the web server (http://127.0.0.1:8000)</w:t>
@@ -1974,7 +1969,7 @@
     </w:p>
     <w:p>
       <w:pPr>
-        <w:spacing w:before="0" w:after="80" w:line="276" w:lineRule="auto"/>
+        <w:spacing w:after="80" w:line="276" w:lineRule="auto"/>
         <w:ind w:left="360" w:hanging="360"/>
       </w:pPr>
       <w:r>
@@ -1986,12 +1981,12 @@
       </w:r>
       <w:r>
         <w:rPr>
-          <w:color w:val="C55A11"/>
-          <w:rFonts w:ascii="Consolas" w:hAnsi="Consolas" w:cs="Consolas"/>
-          <w:sz w:val="19"/>
-          <w:szCs w:val="19"/>
-        </w:rPr>
-        <w:t xml:space="preserve">npm run dev</w:t>
+          <w:rFonts w:ascii="Consolas" w:hAnsi="Consolas" w:cs="Consolas"/>
+          <w:color w:val="C55A11"/>
+          <w:sz w:val="19"/>
+          <w:szCs w:val="19"/>
+        </w:rPr>
+        <w:t>npm run dev</w:t>
       </w:r>
       <w:r>
         <w:t xml:space="preserve">  — Vite dev server with hot reloading for assets</w:t>
@@ -1999,7 +1994,7 @@
     </w:p>
     <w:p>
       <w:pPr>
-        <w:spacing w:before="0" w:after="80" w:line="276" w:lineRule="auto"/>
+        <w:spacing w:after="80" w:line="276" w:lineRule="auto"/>
         <w:ind w:left="360" w:hanging="360"/>
       </w:pPr>
       <w:r>
@@ -2011,12 +2006,12 @@
       </w:r>
       <w:r>
         <w:rPr>
-          <w:color w:val="C55A11"/>
-          <w:rFonts w:ascii="Consolas" w:hAnsi="Consolas" w:cs="Consolas"/>
-          <w:sz w:val="19"/>
-          <w:szCs w:val="19"/>
-        </w:rPr>
-        <w:t xml:space="preserve">php artisan queue:listen</w:t>
+          <w:rFonts w:ascii="Consolas" w:hAnsi="Consolas" w:cs="Consolas"/>
+          <w:color w:val="C55A11"/>
+          <w:sz w:val="19"/>
+          <w:szCs w:val="19"/>
+        </w:rPr>
+        <w:t>php artisan queue:listen</w:t>
       </w:r>
       <w:r>
         <w:t xml:space="preserve">  — process background jobs</w:t>
@@ -2032,25 +2027,27 @@
       </w:pPr>
       <w:r>
         <w:rPr>
+          <w:rFonts w:ascii="Calibri Light" w:hAnsi="Calibri Light" w:cs="Calibri Light"/>
           <w:b/>
           <w:color w:val="2F5496"/>
-          <w:rFonts w:ascii="Calibri Light" w:hAnsi="Calibri Light" w:cs="Calibri Light"/>
           <w:sz w:val="32"/>
           <w:szCs w:val="32"/>
         </w:rPr>
-        <w:t xml:space="preserve">8.  Useful Commands Reference</w:t>
+        <w:lastRenderedPageBreak/>
+        <w:t>8.  Useful Commands Reference</w:t>
       </w:r>
     </w:p>
     <w:tbl>
       <w:tblPr>
         <w:tblW w:w="9360" w:type="dxa"/>
+        <w:tblInd w:w="120" w:type="dxa"/>
         <w:tblBorders>
-          <w:top w:val="single" w:sz="4" w:color="D6DCE5"/>
-          <w:left w:val="single" w:sz="4" w:color="D6DCE5"/>
-          <w:bottom w:val="single" w:sz="4" w:color="D6DCE5"/>
-          <w:right w:val="single" w:sz="4" w:color="D6DCE5"/>
-          <w:insideH w:val="single" w:sz="4" w:color="D6DCE5"/>
-          <w:insideV w:val="single" w:sz="4" w:color="D6DCE5"/>
+          <w:top w:val="single" w:sz="4" w:space="0" w:color="D6DCE5"/>
+          <w:left w:val="single" w:sz="4" w:space="0" w:color="D6DCE5"/>
+          <w:bottom w:val="single" w:sz="4" w:space="0" w:color="D6DCE5"/>
+          <w:right w:val="single" w:sz="4" w:space="0" w:color="D6DCE5"/>
+          <w:insideH w:val="single" w:sz="4" w:space="0" w:color="D6DCE5"/>
+          <w:insideV w:val="single" w:sz="4" w:space="0" w:color="D6DCE5"/>
         </w:tblBorders>
         <w:tblCellMar>
           <w:top w:w="60" w:type="dxa"/>
@@ -2058,6 +2055,7 @@
           <w:bottom w:w="60" w:type="dxa"/>
           <w:right w:w="120" w:type="dxa"/>
         </w:tblCellMar>
+        <w:tblLook w:val="04A0" w:firstRow="1" w:lastRow="0" w:firstColumn="1" w:lastColumn="0" w:noHBand="0" w:noVBand="1"/>
       </w:tblPr>
       <w:tblGrid>
         <w:gridCol w:w="4200"/>
@@ -2084,7 +2082,7 @@
                 <w:sz w:val="20"/>
                 <w:szCs w:val="20"/>
               </w:rPr>
-              <w:t xml:space="preserve">Command</w:t>
+              <w:t>Command</w:t>
             </w:r>
           </w:p>
         </w:tc>
@@ -2105,7 +2103,7 @@
                 <w:sz w:val="20"/>
                 <w:szCs w:val="20"/>
               </w:rPr>
-              <w:t xml:space="preserve">What it does</w:t>
+              <w:t>What it does</w:t>
             </w:r>
           </w:p>
         </w:tc>
@@ -2123,12 +2121,12 @@
             </w:pPr>
             <w:r>
               <w:rPr>
+                <w:rFonts w:ascii="Consolas" w:hAnsi="Consolas" w:cs="Consolas"/>
                 <w:color w:val="C55A11"/>
-                <w:rFonts w:ascii="Consolas" w:hAnsi="Consolas" w:cs="Consolas"/>
                 <w:sz w:val="19"/>
                 <w:szCs w:val="19"/>
               </w:rPr>
-              <w:t xml:space="preserve">composer setup</w:t>
+              <w:t>composer setup</w:t>
             </w:r>
           </w:p>
         </w:tc>
@@ -2147,7 +2145,7 @@
                 <w:sz w:val="20"/>
                 <w:szCs w:val="20"/>
               </w:rPr>
-              <w:t xml:space="preserve">Full one-shot setup of a fresh clone</w:t>
+              <w:t>Full one-shot setup of a fresh clone</w:t>
             </w:r>
           </w:p>
         </w:tc>
@@ -2165,12 +2163,12 @@
             </w:pPr>
             <w:r>
               <w:rPr>
+                <w:rFonts w:ascii="Consolas" w:hAnsi="Consolas" w:cs="Consolas"/>
                 <w:color w:val="C55A11"/>
-                <w:rFonts w:ascii="Consolas" w:hAnsi="Consolas" w:cs="Consolas"/>
                 <w:sz w:val="19"/>
                 <w:szCs w:val="19"/>
               </w:rPr>
-              <w:t xml:space="preserve">composer dev</w:t>
+              <w:t>composer dev</w:t>
             </w:r>
           </w:p>
         </w:tc>
@@ -2189,7 +2187,7 @@
                 <w:sz w:val="20"/>
                 <w:szCs w:val="20"/>
               </w:rPr>
-              <w:t xml:space="preserve">Run server + queue + Vite together</w:t>
+              <w:t>Run server + queue + Vite together</w:t>
             </w:r>
           </w:p>
         </w:tc>
@@ -2207,12 +2205,12 @@
             </w:pPr>
             <w:r>
               <w:rPr>
+                <w:rFonts w:ascii="Consolas" w:hAnsi="Consolas" w:cs="Consolas"/>
                 <w:color w:val="C55A11"/>
-                <w:rFonts w:ascii="Consolas" w:hAnsi="Consolas" w:cs="Consolas"/>
                 <w:sz w:val="19"/>
                 <w:szCs w:val="19"/>
               </w:rPr>
-              <w:t xml:space="preserve">composer test</w:t>
+              <w:t>composer test</w:t>
             </w:r>
           </w:p>
         </w:tc>
@@ -2231,7 +2229,7 @@
                 <w:sz w:val="20"/>
                 <w:szCs w:val="20"/>
               </w:rPr>
-              <w:t xml:space="preserve">Run the Pest test suite</w:t>
+              <w:t>Run the Pest test suite</w:t>
             </w:r>
           </w:p>
         </w:tc>
@@ -2249,12 +2247,12 @@
             </w:pPr>
             <w:r>
               <w:rPr>
+                <w:rFonts w:ascii="Consolas" w:hAnsi="Consolas" w:cs="Consolas"/>
                 <w:color w:val="C55A11"/>
-                <w:rFonts w:ascii="Consolas" w:hAnsi="Consolas" w:cs="Consolas"/>
                 <w:sz w:val="19"/>
                 <w:szCs w:val="19"/>
               </w:rPr>
-              <w:t xml:space="preserve">php artisan migrate:fresh --seed</w:t>
+              <w:t>php artisan migrate:fresh --seed</w:t>
             </w:r>
           </w:p>
         </w:tc>
@@ -2273,7 +2271,7 @@
                 <w:sz w:val="20"/>
                 <w:szCs w:val="20"/>
               </w:rPr>
-              <w:t xml:space="preserve">Wipe &amp; rebuild DB with seed data</w:t>
+              <w:t>Wipe &amp; rebuild DB with seed data</w:t>
             </w:r>
           </w:p>
         </w:tc>
@@ -2291,12 +2289,12 @@
             </w:pPr>
             <w:r>
               <w:rPr>
+                <w:rFonts w:ascii="Consolas" w:hAnsi="Consolas" w:cs="Consolas"/>
                 <w:color w:val="C55A11"/>
-                <w:rFonts w:ascii="Consolas" w:hAnsi="Consolas" w:cs="Consolas"/>
                 <w:sz w:val="19"/>
                 <w:szCs w:val="19"/>
               </w:rPr>
-              <w:t xml:space="preserve">php artisan optimize:clear</w:t>
+              <w:t>php artisan optimize:clear</w:t>
             </w:r>
           </w:p>
         </w:tc>
@@ -2315,7 +2313,7 @@
                 <w:sz w:val="20"/>
                 <w:szCs w:val="20"/>
               </w:rPr>
-              <w:t xml:space="preserve">Clear all cached config/routes/views</w:t>
+              <w:t>Clear all cached config/routes/views</w:t>
             </w:r>
           </w:p>
         </w:tc>
@@ -2333,12 +2331,12 @@
             </w:pPr>
             <w:r>
               <w:rPr>
+                <w:rFonts w:ascii="Consolas" w:hAnsi="Consolas" w:cs="Consolas"/>
                 <w:color w:val="C55A11"/>
-                <w:rFonts w:ascii="Consolas" w:hAnsi="Consolas" w:cs="Consolas"/>
                 <w:sz w:val="19"/>
                 <w:szCs w:val="19"/>
               </w:rPr>
-              <w:t xml:space="preserve">./vendor/bin/pint</w:t>
+              <w:t>./vendor/bin/pint</w:t>
             </w:r>
           </w:p>
         </w:tc>
@@ -2357,7 +2355,7 @@
                 <w:sz w:val="20"/>
                 <w:szCs w:val="20"/>
               </w:rPr>
-              <w:t xml:space="preserve">Auto-format PHP code to project style</w:t>
+              <w:t>Auto-format PHP code to project style</w:t>
             </w:r>
           </w:p>
         </w:tc>
@@ -2375,12 +2373,12 @@
             </w:pPr>
             <w:r>
               <w:rPr>
+                <w:rFonts w:ascii="Consolas" w:hAnsi="Consolas" w:cs="Consolas"/>
                 <w:color w:val="C55A11"/>
-                <w:rFonts w:ascii="Consolas" w:hAnsi="Consolas" w:cs="Consolas"/>
                 <w:sz w:val="19"/>
                 <w:szCs w:val="19"/>
               </w:rPr>
-              <w:t xml:space="preserve">npm run build</w:t>
+              <w:t>npm run build</w:t>
             </w:r>
           </w:p>
         </w:tc>
@@ -2399,7 +2397,7 @@
                 <w:sz w:val="20"/>
                 <w:szCs w:val="20"/>
               </w:rPr>
-              <w:t xml:space="preserve">Recompile front-end assets for production</w:t>
+              <w:t>Recompile front-end assets for production</w:t>
             </w:r>
           </w:p>
         </w:tc>
@@ -2407,7 +2405,7 @@
     </w:tbl>
     <w:p>
       <w:pPr>
-        <w:spacing w:before="0" w:after="120" w:line="120" w:lineRule="auto"/>
+        <w:spacing w:after="120" w:line="120" w:lineRule="auto"/>
       </w:pPr>
     </w:p>
     <w:p>
@@ -2420,25 +2418,26 @@
       </w:pPr>
       <w:r>
         <w:rPr>
+          <w:rFonts w:ascii="Calibri Light" w:hAnsi="Calibri Light" w:cs="Calibri Light"/>
           <w:b/>
           <w:color w:val="2F5496"/>
-          <w:rFonts w:ascii="Calibri Light" w:hAnsi="Calibri Light" w:cs="Calibri Light"/>
           <w:sz w:val="32"/>
           <w:szCs w:val="32"/>
         </w:rPr>
-        <w:t xml:space="preserve">9.  Troubleshooting</w:t>
+        <w:t>9.  Troubleshooting</w:t>
       </w:r>
     </w:p>
     <w:tbl>
       <w:tblPr>
         <w:tblW w:w="9360" w:type="dxa"/>
+        <w:tblInd w:w="120" w:type="dxa"/>
         <w:tblBorders>
-          <w:top w:val="single" w:sz="4" w:color="D6DCE5"/>
-          <w:left w:val="single" w:sz="4" w:color="D6DCE5"/>
-          <w:bottom w:val="single" w:sz="4" w:color="D6DCE5"/>
-          <w:right w:val="single" w:sz="4" w:color="D6DCE5"/>
-          <w:insideH w:val="single" w:sz="4" w:color="D6DCE5"/>
-          <w:insideV w:val="single" w:sz="4" w:color="D6DCE5"/>
+          <w:top w:val="single" w:sz="4" w:space="0" w:color="D6DCE5"/>
+          <w:left w:val="single" w:sz="4" w:space="0" w:color="D6DCE5"/>
+          <w:bottom w:val="single" w:sz="4" w:space="0" w:color="D6DCE5"/>
+          <w:right w:val="single" w:sz="4" w:space="0" w:color="D6DCE5"/>
+          <w:insideH w:val="single" w:sz="4" w:space="0" w:color="D6DCE5"/>
+          <w:insideV w:val="single" w:sz="4" w:space="0" w:color="D6DCE5"/>
         </w:tblBorders>
         <w:tblCellMar>
           <w:top w:w="60" w:type="dxa"/>
@@ -2446,6 +2445,7 @@
           <w:bottom w:w="60" w:type="dxa"/>
           <w:right w:w="120" w:type="dxa"/>
         </w:tblCellMar>
+        <w:tblLook w:val="04A0" w:firstRow="1" w:lastRow="0" w:firstColumn="1" w:lastColumn="0" w:noHBand="0" w:noVBand="1"/>
       </w:tblPr>
       <w:tblGrid>
         <w:gridCol w:w="3600"/>
@@ -2472,7 +2472,7 @@
                 <w:sz w:val="20"/>
                 <w:szCs w:val="20"/>
               </w:rPr>
-              <w:t xml:space="preserve">Symptom</w:t>
+              <w:t>Symptom</w:t>
             </w:r>
           </w:p>
         </w:tc>
@@ -2493,7 +2493,7 @@
                 <w:sz w:val="20"/>
                 <w:szCs w:val="20"/>
               </w:rPr>
-              <w:t xml:space="preserve">Likely cause &amp; fix</w:t>
+              <w:t>Likely cause &amp; fix</w:t>
             </w:r>
           </w:p>
         </w:tc>
@@ -2514,7 +2514,7 @@
                 <w:sz w:val="20"/>
                 <w:szCs w:val="20"/>
               </w:rPr>
-              <w:t xml:space="preserve">“No application encryption key has been specified”</w:t>
+              <w:t>“No application encryption key has been specified”</w:t>
             </w:r>
           </w:p>
         </w:tc>
@@ -2533,15 +2533,15 @@
             </w:r>
             <w:r>
               <w:rPr>
+                <w:rFonts w:ascii="Consolas" w:hAnsi="Consolas" w:cs="Consolas"/>
                 <w:color w:val="C55A11"/>
-                <w:rFonts w:ascii="Consolas" w:hAnsi="Consolas" w:cs="Consolas"/>
                 <w:sz w:val="19"/>
                 <w:szCs w:val="19"/>
               </w:rPr>
-              <w:t xml:space="preserve">php artisan key:generate</w:t>
-            </w:r>
-            <w:r>
-              <w:t xml:space="preserve">.</w:t>
+              <w:t>php artisan key:generate</w:t>
+            </w:r>
+            <w:r>
+              <w:t>.</w:t>
             </w:r>
           </w:p>
         </w:tc>
@@ -2562,7 +2562,7 @@
                 <w:sz w:val="20"/>
                 <w:szCs w:val="20"/>
               </w:rPr>
-              <w:t xml:space="preserve">SQLSTATE / database connection error</w:t>
+              <w:t>SQLSTATE / database connection error</w:t>
             </w:r>
           </w:p>
         </w:tc>
@@ -2581,12 +2581,12 @@
             </w:r>
             <w:r>
               <w:rPr>
+                <w:rFonts w:ascii="Consolas" w:hAnsi="Consolas" w:cs="Consolas"/>
                 <w:color w:val="C55A11"/>
-                <w:rFonts w:ascii="Consolas" w:hAnsi="Consolas" w:cs="Consolas"/>
                 <w:sz w:val="19"/>
                 <w:szCs w:val="19"/>
               </w:rPr>
-              <w:t xml:space="preserve">.env</w:t>
+              <w:t>.env</w:t>
             </w:r>
             <w:r>
               <w:t xml:space="preserve"> DB settings and that MySQL is running in XAMPP.</w:t>
@@ -2610,7 +2610,7 @@
                 <w:sz w:val="20"/>
                 <w:szCs w:val="20"/>
               </w:rPr>
-              <w:t xml:space="preserve">Vite manifest not found</w:t>
+              <w:t>Vite manifest not found</w:t>
             </w:r>
           </w:p>
         </w:tc>
@@ -2629,27 +2629,27 @@
             </w:r>
             <w:r>
               <w:rPr>
+                <w:rFonts w:ascii="Consolas" w:hAnsi="Consolas" w:cs="Consolas"/>
                 <w:color w:val="C55A11"/>
-                <w:rFonts w:ascii="Consolas" w:hAnsi="Consolas" w:cs="Consolas"/>
                 <w:sz w:val="19"/>
                 <w:szCs w:val="19"/>
               </w:rPr>
-              <w:t xml:space="preserve">npm install</w:t>
+              <w:t>npm install</w:t>
             </w:r>
             <w:r>
               <w:t xml:space="preserve"> then </w:t>
             </w:r>
             <w:r>
               <w:rPr>
+                <w:rFonts w:ascii="Consolas" w:hAnsi="Consolas" w:cs="Consolas"/>
                 <w:color w:val="C55A11"/>
-                <w:rFonts w:ascii="Consolas" w:hAnsi="Consolas" w:cs="Consolas"/>
                 <w:sz w:val="19"/>
                 <w:szCs w:val="19"/>
               </w:rPr>
-              <w:t xml:space="preserve">npm run build</w:t>
-            </w:r>
-            <w:r>
-              <w:t xml:space="preserve">.</w:t>
+              <w:t>npm run build</w:t>
+            </w:r>
+            <w:r>
+              <w:t>.</w:t>
             </w:r>
           </w:p>
         </w:tc>
@@ -2670,7 +2670,7 @@
                 <w:sz w:val="20"/>
                 <w:szCs w:val="20"/>
               </w:rPr>
-              <w:t xml:space="preserve">Styles / images not loading</w:t>
+              <w:t>Styles / images not loading</w:t>
             </w:r>
           </w:p>
         </w:tc>
@@ -2689,12 +2689,12 @@
             </w:r>
             <w:r>
               <w:rPr>
+                <w:rFonts w:ascii="Consolas" w:hAnsi="Consolas" w:cs="Consolas"/>
                 <w:color w:val="C55A11"/>
-                <w:rFonts w:ascii="Consolas" w:hAnsi="Consolas" w:cs="Consolas"/>
                 <w:sz w:val="19"/>
                 <w:szCs w:val="19"/>
               </w:rPr>
-              <w:t xml:space="preserve">php artisan storage:link</w:t>
+              <w:t>php artisan storage:link</w:t>
             </w:r>
             <w:r>
               <w:t xml:space="preserve"> and rebuild assets.</w:t>
@@ -2718,7 +2718,7 @@
                 <w:sz w:val="20"/>
                 <w:szCs w:val="20"/>
               </w:rPr>
-              <w:t xml:space="preserve">Class not found after pulling changes</w:t>
+              <w:t>Class not found after pulling changes</w:t>
             </w:r>
           </w:p>
         </w:tc>
@@ -2737,27 +2737,27 @@
             </w:r>
             <w:r>
               <w:rPr>
+                <w:rFonts w:ascii="Consolas" w:hAnsi="Consolas" w:cs="Consolas"/>
                 <w:color w:val="C55A11"/>
-                <w:rFonts w:ascii="Consolas" w:hAnsi="Consolas" w:cs="Consolas"/>
                 <w:sz w:val="19"/>
                 <w:szCs w:val="19"/>
               </w:rPr>
-              <w:t xml:space="preserve">composer install</w:t>
+              <w:t>composer install</w:t>
             </w:r>
             <w:r>
               <w:t xml:space="preserve"> and </w:t>
             </w:r>
             <w:r>
               <w:rPr>
+                <w:rFonts w:ascii="Consolas" w:hAnsi="Consolas" w:cs="Consolas"/>
                 <w:color w:val="C55A11"/>
-                <w:rFonts w:ascii="Consolas" w:hAnsi="Consolas" w:cs="Consolas"/>
                 <w:sz w:val="19"/>
                 <w:szCs w:val="19"/>
               </w:rPr>
-              <w:t xml:space="preserve">composer dump-autoload</w:t>
-            </w:r>
-            <w:r>
-              <w:t xml:space="preserve">.</w:t>
+              <w:t>composer dump-autoload</w:t>
+            </w:r>
+            <w:r>
+              <w:t>.</w:t>
             </w:r>
           </w:p>
         </w:tc>
@@ -2765,19 +2765,19 @@
     </w:tbl>
     <w:p>
       <w:pPr>
-        <w:spacing w:before="0" w:after="120" w:line="120" w:lineRule="auto"/>
-      </w:pPr>
-    </w:p>
-    <w:p>
-      <w:pPr>
-        <w:shd w:val="clear" w:color="auto" w:fill="FFF4E5"/>
+        <w:spacing w:after="120" w:line="120" w:lineRule="auto"/>
+      </w:pPr>
+    </w:p>
+    <w:p>
+      <w:pPr>
         <w:pBdr>
           <w:top w:val="single" w:sz="6" w:space="4" w:color="C55A11"/>
           <w:left w:val="single" w:sz="24" w:space="6" w:color="C55A11"/>
           <w:bottom w:val="single" w:sz="6" w:space="4" w:color="C55A11"/>
           <w:right w:val="single" w:sz="6" w:space="4" w:color="C55A11"/>
         </w:pBdr>
-        <w:spacing w:before="120" w:after="160" w:line="276" w:lineRule="auto"/>
+        <w:shd w:val="clear" w:color="auto" w:fill="FFF4E5"/>
+        <w:spacing w:before="120" w:line="276" w:lineRule="auto"/>
         <w:ind w:left="120"/>
       </w:pPr>
       <w:r>
@@ -2792,36 +2792,36 @@
       </w:r>
       <w:r>
         <w:rPr>
-          <w:color w:val="C55A11"/>
-          <w:rFonts w:ascii="Consolas" w:hAnsi="Consolas" w:cs="Consolas"/>
-          <w:sz w:val="19"/>
-          <w:szCs w:val="19"/>
-        </w:rPr>
-        <w:t xml:space="preserve">composer install</w:t>
+          <w:rFonts w:ascii="Consolas" w:hAnsi="Consolas" w:cs="Consolas"/>
+          <w:color w:val="C55A11"/>
+          <w:sz w:val="19"/>
+          <w:szCs w:val="19"/>
+        </w:rPr>
+        <w:t>composer install</w:t>
       </w:r>
       <w:r>
         <w:t xml:space="preserve">, </w:t>
       </w:r>
       <w:r>
         <w:rPr>
-          <w:color w:val="C55A11"/>
-          <w:rFonts w:ascii="Consolas" w:hAnsi="Consolas" w:cs="Consolas"/>
-          <w:sz w:val="19"/>
-          <w:szCs w:val="19"/>
-        </w:rPr>
-        <w:t xml:space="preserve">npm install</w:t>
+          <w:rFonts w:ascii="Consolas" w:hAnsi="Consolas" w:cs="Consolas"/>
+          <w:color w:val="C55A11"/>
+          <w:sz w:val="19"/>
+          <w:szCs w:val="19"/>
+        </w:rPr>
+        <w:t>npm install</w:t>
       </w:r>
       <w:r>
         <w:t xml:space="preserve">, and </w:t>
       </w:r>
       <w:r>
         <w:rPr>
-          <w:color w:val="C55A11"/>
-          <w:rFonts w:ascii="Consolas" w:hAnsi="Consolas" w:cs="Consolas"/>
-          <w:sz w:val="19"/>
-          <w:szCs w:val="19"/>
-        </w:rPr>
-        <w:t xml:space="preserve">php artisan migrate</w:t>
+          <w:rFonts w:ascii="Consolas" w:hAnsi="Consolas" w:cs="Consolas"/>
+          <w:color w:val="C55A11"/>
+          <w:sz w:val="19"/>
+          <w:szCs w:val="19"/>
+        </w:rPr>
+        <w:t>php artisan migrate</w:t>
       </w:r>
       <w:r>
         <w:t xml:space="preserve"> again in case dependencies or the schema changed.</w:t>
@@ -2830,25 +2830,753 @@
     <w:sectPr>
       <w:pgSz w:w="12240" w:h="15840"/>
       <w:pgMar w:top="1440" w:right="1440" w:bottom="1440" w:left="1440" w:header="720" w:footer="720" w:gutter="0"/>
+      <w:cols w:space="720"/>
     </w:sectPr>
   </w:body>
 </w:document>
 </file>
 
 <file path=word/styles.xml><?xml version="1.0" encoding="utf-8"?>
-<w:styles xmlns:w="http://schemas.openxmlformats.org/wordprocessingml/2006/main">
+<w:styles xmlns:mc="http://schemas.openxmlformats.org/markup-compatibility/2006" xmlns:r="http://schemas.openxmlformats.org/officeDocument/2006/relationships" xmlns:w="http://schemas.openxmlformats.org/wordprocessingml/2006/main" xmlns:w14="http://schemas.microsoft.com/office/word/2010/wordml" xmlns:w15="http://schemas.microsoft.com/office/word/2012/wordml" xmlns:w16cex="http://schemas.microsoft.com/office/word/2018/wordml/cex" xmlns:w16cid="http://schemas.microsoft.com/office/word/2016/wordml/cid" xmlns:w16="http://schemas.microsoft.com/office/word/2018/wordml" xmlns:w16du="http://schemas.microsoft.com/office/word/2023/wordml/word16du" xmlns:w16sdtdh="http://schemas.microsoft.com/office/word/2020/wordml/sdtdatahash" xmlns:w16sdtfl="http://schemas.microsoft.com/office/word/2024/wordml/sdtformatlock" xmlns:w16se="http://schemas.microsoft.com/office/word/2015/wordml/symex" mc:Ignorable="w14 w15 w16se w16cid w16 w16cex w16sdtdh w16sdtfl w16du">
   <w:docDefaults>
     <w:rPrDefault>
       <w:rPr>
-        <w:rFonts w:ascii="Calibri" w:hAnsi="Calibri" w:cs="Calibri"/>
+        <w:rFonts w:ascii="Calibri" w:eastAsia="Times New Roman" w:hAnsi="Calibri" w:cs="Calibri"/>
+        <w:color w:val="262626"/>
         <w:sz w:val="22"/>
         <w:szCs w:val="22"/>
-        <w:color w:val="262626"/>
+        <w:lang w:val="en-US" w:eastAsia="en-US" w:bidi="km-KH"/>
       </w:rPr>
     </w:rPrDefault>
+    <w:pPrDefault>
+      <w:pPr>
+        <w:spacing w:after="160" w:line="278" w:lineRule="auto"/>
+      </w:pPr>
+    </w:pPrDefault>
   </w:docDefaults>
+  <w:latentStyles w:defLockedState="0" w:defUIPriority="99" w:defSemiHidden="0" w:defUnhideWhenUsed="0" w:defQFormat="0" w:count="376">
+    <w:lsdException w:name="Normal" w:uiPriority="0" w:qFormat="1"/>
+    <w:lsdException w:name="heading 1" w:uiPriority="9" w:qFormat="1"/>
+    <w:lsdException w:name="heading 2" w:semiHidden="1" w:uiPriority="9" w:unhideWhenUsed="1" w:qFormat="1"/>
+    <w:lsdException w:name="heading 3" w:semiHidden="1" w:uiPriority="9" w:unhideWhenUsed="1" w:qFormat="1"/>
+    <w:lsdException w:name="heading 4" w:semiHidden="1" w:uiPriority="9" w:unhideWhenUsed="1" w:qFormat="1"/>
+    <w:lsdException w:name="heading 5" w:semiHidden="1" w:uiPriority="9" w:unhideWhenUsed="1" w:qFormat="1"/>
+    <w:lsdException w:name="heading 6" w:semiHidden="1" w:uiPriority="9" w:unhideWhenUsed="1" w:qFormat="1"/>
+    <w:lsdException w:name="heading 7" w:semiHidden="1" w:uiPriority="9" w:unhideWhenUsed="1" w:qFormat="1"/>
+    <w:lsdException w:name="heading 8" w:semiHidden="1" w:uiPriority="9" w:unhideWhenUsed="1" w:qFormat="1"/>
+    <w:lsdException w:name="heading 9" w:semiHidden="1" w:uiPriority="9" w:unhideWhenUsed="1" w:qFormat="1"/>
+    <w:lsdException w:name="index 1" w:semiHidden="1" w:unhideWhenUsed="1"/>
+    <w:lsdException w:name="index 2" w:semiHidden="1" w:unhideWhenUsed="1"/>
+    <w:lsdException w:name="index 3" w:semiHidden="1" w:unhideWhenUsed="1"/>
+    <w:lsdException w:name="index 4" w:semiHidden="1" w:unhideWhenUsed="1"/>
+    <w:lsdException w:name="index 5" w:semiHidden="1" w:unhideWhenUsed="1"/>
+    <w:lsdException w:name="index 6" w:semiHidden="1" w:unhideWhenUsed="1"/>
+    <w:lsdException w:name="index 7" w:semiHidden="1" w:unhideWhenUsed="1"/>
+    <w:lsdException w:name="index 8" w:semiHidden="1" w:unhideWhenUsed="1"/>
+    <w:lsdException w:name="index 9" w:semiHidden="1" w:unhideWhenUsed="1"/>
+    <w:lsdException w:name="toc 1" w:semiHidden="1" w:uiPriority="39" w:unhideWhenUsed="1"/>
+    <w:lsdException w:name="toc 2" w:semiHidden="1" w:uiPriority="39" w:unhideWhenUsed="1"/>
+    <w:lsdException w:name="toc 3" w:semiHidden="1" w:uiPriority="39" w:unhideWhenUsed="1"/>
+    <w:lsdException w:name="toc 4" w:semiHidden="1" w:uiPriority="39" w:unhideWhenUsed="1"/>
+    <w:lsdException w:name="toc 5" w:semiHidden="1" w:uiPriority="39" w:unhideWhenUsed="1"/>
+    <w:lsdException w:name="toc 6" w:semiHidden="1" w:uiPriority="39" w:unhideWhenUsed="1"/>
+    <w:lsdException w:name="toc 7" w:semiHidden="1" w:uiPriority="39" w:unhideWhenUsed="1"/>
+    <w:lsdException w:name="toc 8" w:semiHidden="1" w:uiPriority="39" w:unhideWhenUsed="1"/>
+    <w:lsdException w:name="toc 9" w:semiHidden="1" w:uiPriority="39" w:unhideWhenUsed="1"/>
+    <w:lsdException w:name="Normal Indent" w:semiHidden="1" w:unhideWhenUsed="1"/>
+    <w:lsdException w:name="footnote text" w:semiHidden="1" w:unhideWhenUsed="1"/>
+    <w:lsdException w:name="annotation text" w:semiHidden="1" w:unhideWhenUsed="1"/>
+    <w:lsdException w:name="header" w:semiHidden="1" w:unhideWhenUsed="1"/>
+    <w:lsdException w:name="footer" w:semiHidden="1" w:unhideWhenUsed="1"/>
+    <w:lsdException w:name="index heading" w:semiHidden="1" w:unhideWhenUsed="1"/>
+    <w:lsdException w:name="caption" w:semiHidden="1" w:uiPriority="35" w:unhideWhenUsed="1" w:qFormat="1"/>
+    <w:lsdException w:name="table of figures" w:semiHidden="1" w:unhideWhenUsed="1"/>
+    <w:lsdException w:name="envelope address" w:semiHidden="1" w:unhideWhenUsed="1"/>
+    <w:lsdException w:name="envelope return" w:semiHidden="1" w:unhideWhenUsed="1"/>
+    <w:lsdException w:name="footnote reference" w:semiHidden="1" w:unhideWhenUsed="1"/>
+    <w:lsdException w:name="annotation reference" w:semiHidden="1" w:unhideWhenUsed="1"/>
+    <w:lsdException w:name="line number" w:semiHidden="1" w:unhideWhenUsed="1"/>
+    <w:lsdException w:name="page number" w:semiHidden="1" w:unhideWhenUsed="1"/>
+    <w:lsdException w:name="endnote reference" w:semiHidden="1" w:unhideWhenUsed="1"/>
+    <w:lsdException w:name="endnote text" w:semiHidden="1" w:unhideWhenUsed="1"/>
+    <w:lsdException w:name="table of authorities" w:semiHidden="1" w:unhideWhenUsed="1"/>
+    <w:lsdException w:name="macro" w:semiHidden="1" w:unhideWhenUsed="1"/>
+    <w:lsdException w:name="toa heading" w:semiHidden="1" w:unhideWhenUsed="1"/>
+    <w:lsdException w:name="List" w:semiHidden="1" w:unhideWhenUsed="1"/>
+    <w:lsdException w:name="List Bullet" w:semiHidden="1" w:unhideWhenUsed="1"/>
+    <w:lsdException w:name="List Number" w:semiHidden="1" w:unhideWhenUsed="1"/>
+    <w:lsdException w:name="List 2" w:semiHidden="1" w:unhideWhenUsed="1"/>
+    <w:lsdException w:name="List 3" w:semiHidden="1" w:unhideWhenUsed="1"/>
+    <w:lsdException w:name="List 4" w:semiHidden="1" w:unhideWhenUsed="1"/>
+    <w:lsdException w:name="List 5" w:semiHidden="1" w:unhideWhenUsed="1"/>
+    <w:lsdException w:name="List Bullet 2" w:semiHidden="1" w:unhideWhenUsed="1"/>
+    <w:lsdException w:name="List Bullet 3" w:semiHidden="1" w:unhideWhenUsed="1"/>
+    <w:lsdException w:name="List Bullet 4" w:semiHidden="1" w:unhideWhenUsed="1"/>
+    <w:lsdException w:name="List Bullet 5" w:semiHidden="1" w:unhideWhenUsed="1"/>
+    <w:lsdException w:name="List Number 2" w:semiHidden="1" w:unhideWhenUsed="1"/>
+    <w:lsdException w:name="List Number 3" w:semiHidden="1" w:unhideWhenUsed="1"/>
+    <w:lsdException w:name="List Number 4" w:semiHidden="1" w:unhideWhenUsed="1"/>
+    <w:lsdException w:name="List Number 5" w:semiHidden="1" w:unhideWhenUsed="1"/>
+    <w:lsdException w:name="Title" w:uiPriority="10" w:qFormat="1"/>
+    <w:lsdException w:name="Closing" w:semiHidden="1" w:unhideWhenUsed="1"/>
+    <w:lsdException w:name="Signature" w:semiHidden="1" w:unhideWhenUsed="1"/>
+    <w:lsdException w:name="Default Paragraph Font" w:semiHidden="1" w:uiPriority="1" w:unhideWhenUsed="1"/>
+    <w:lsdException w:name="Body Text" w:semiHidden="1" w:unhideWhenUsed="1"/>
+    <w:lsdException w:name="Body Text Indent" w:semiHidden="1" w:unhideWhenUsed="1"/>
+    <w:lsdException w:name="List Continue" w:semiHidden="1" w:unhideWhenUsed="1"/>
+    <w:lsdException w:name="List Continue 2" w:semiHidden="1" w:unhideWhenUsed="1"/>
+    <w:lsdException w:name="List Continue 3" w:semiHidden="1" w:unhideWhenUsed="1"/>
+    <w:lsdException w:name="List Continue 4" w:semiHidden="1" w:unhideWhenUsed="1"/>
+    <w:lsdException w:name="List Continue 5" w:semiHidden="1" w:unhideWhenUsed="1"/>
+    <w:lsdException w:name="Message Header" w:semiHidden="1" w:unhideWhenUsed="1"/>
+    <w:lsdException w:name="Subtitle" w:uiPriority="11" w:qFormat="1"/>
+    <w:lsdException w:name="Salutation" w:semiHidden="1" w:unhideWhenUsed="1"/>
+    <w:lsdException w:name="Date" w:semiHidden="1" w:unhideWhenUsed="1"/>
+    <w:lsdException w:name="Body Text First Indent" w:semiHidden="1" w:unhideWhenUsed="1"/>
+    <w:lsdException w:name="Body Text First Indent 2" w:semiHidden="1" w:unhideWhenUsed="1"/>
+    <w:lsdException w:name="Note Heading" w:semiHidden="1" w:unhideWhenUsed="1"/>
+    <w:lsdException w:name="Body Text 2" w:semiHidden="1" w:unhideWhenUsed="1"/>
+    <w:lsdException w:name="Body Text 3" w:semiHidden="1" w:unhideWhenUsed="1"/>
+    <w:lsdException w:name="Body Text Indent 2" w:semiHidden="1" w:unhideWhenUsed="1"/>
+    <w:lsdException w:name="Body Text Indent 3" w:semiHidden="1" w:unhideWhenUsed="1"/>
+    <w:lsdException w:name="Block Text" w:semiHidden="1" w:unhideWhenUsed="1"/>
+    <w:lsdException w:name="Hyperlink" w:semiHidden="1" w:unhideWhenUsed="1"/>
+    <w:lsdException w:name="FollowedHyperlink" w:semiHidden="1" w:unhideWhenUsed="1"/>
+    <w:lsdException w:name="Strong" w:uiPriority="22" w:qFormat="1"/>
+    <w:lsdException w:name="Emphasis" w:uiPriority="20" w:qFormat="1"/>
+    <w:lsdException w:name="Document Map" w:semiHidden="1" w:unhideWhenUsed="1"/>
+    <w:lsdException w:name="Plain Text" w:semiHidden="1" w:unhideWhenUsed="1"/>
+    <w:lsdException w:name="E-mail Signature" w:semiHidden="1" w:unhideWhenUsed="1"/>
+    <w:lsdException w:name="HTML Top of Form" w:semiHidden="1" w:unhideWhenUsed="1"/>
+    <w:lsdException w:name="HTML Bottom of Form" w:semiHidden="1" w:unhideWhenUsed="1"/>
+    <w:lsdException w:name="Normal (Web)" w:semiHidden="1" w:unhideWhenUsed="1"/>
+    <w:lsdException w:name="HTML Acronym" w:semiHidden="1" w:unhideWhenUsed="1"/>
+    <w:lsdException w:name="HTML Address" w:semiHidden="1" w:unhideWhenUsed="1"/>
+    <w:lsdException w:name="HTML Cite" w:semiHidden="1" w:unhideWhenUsed="1"/>
+    <w:lsdException w:name="HTML Code" w:semiHidden="1" w:unhideWhenUsed="1"/>
+    <w:lsdException w:name="HTML Definition" w:semiHidden="1" w:unhideWhenUsed="1"/>
+    <w:lsdException w:name="HTML Keyboard" w:semiHidden="1" w:unhideWhenUsed="1"/>
+    <w:lsdException w:name="HTML Preformatted" w:semiHidden="1" w:unhideWhenUsed="1"/>
+    <w:lsdException w:name="HTML Sample" w:semiHidden="1" w:unhideWhenUsed="1"/>
+    <w:lsdException w:name="HTML Typewriter" w:semiHidden="1" w:unhideWhenUsed="1"/>
+    <w:lsdException w:name="HTML Variable" w:semiHidden="1" w:unhideWhenUsed="1"/>
+    <w:lsdException w:name="Normal Table" w:semiHidden="1" w:unhideWhenUsed="1"/>
+    <w:lsdException w:name="annotation subject" w:semiHidden="1" w:unhideWhenUsed="1"/>
+    <w:lsdException w:name="No List" w:semiHidden="1" w:unhideWhenUsed="1"/>
+    <w:lsdException w:name="Outline List 1" w:semiHidden="1" w:unhideWhenUsed="1"/>
+    <w:lsdException w:name="Outline List 2" w:semiHidden="1" w:unhideWhenUsed="1"/>
+    <w:lsdException w:name="Outline List 3" w:semiHidden="1" w:unhideWhenUsed="1"/>
+    <w:lsdException w:name="Table Simple 1" w:semiHidden="1" w:unhideWhenUsed="1"/>
+    <w:lsdException w:name="Table Simple 2" w:semiHidden="1" w:unhideWhenUsed="1"/>
+    <w:lsdException w:name="Table Simple 3" w:semiHidden="1" w:unhideWhenUsed="1"/>
+    <w:lsdException w:name="Table Classic 1" w:semiHidden="1" w:unhideWhenUsed="1"/>
+    <w:lsdException w:name="Table Classic 2" w:semiHidden="1" w:unhideWhenUsed="1"/>
+    <w:lsdException w:name="Table Classic 3" w:semiHidden="1" w:unhideWhenUsed="1"/>
+    <w:lsdException w:name="Table Classic 4" w:semiHidden="1" w:unhideWhenUsed="1"/>
+    <w:lsdException w:name="Table Colorful 1" w:semiHidden="1" w:unhideWhenUsed="1"/>
+    <w:lsdException w:name="Table Colorful 2" w:semiHidden="1" w:unhideWhenUsed="1"/>
+    <w:lsdException w:name="Table Colorful 3" w:semiHidden="1" w:unhideWhenUsed="1"/>
+    <w:lsdException w:name="Table Columns 1" w:semiHidden="1" w:unhideWhenUsed="1"/>
+    <w:lsdException w:name="Table Columns 2" w:semiHidden="1" w:unhideWhenUsed="1"/>
+    <w:lsdException w:name="Table Columns 3" w:semiHidden="1" w:unhideWhenUsed="1"/>
+    <w:lsdException w:name="Table Columns 4" w:semiHidden="1" w:unhideWhenUsed="1"/>
+    <w:lsdException w:name="Table Columns 5" w:semiHidden="1" w:unhideWhenUsed="1"/>
+    <w:lsdException w:name="Table Grid 1" w:semiHidden="1" w:unhideWhenUsed="1"/>
+    <w:lsdException w:name="Table Grid 2" w:semiHidden="1" w:unhideWhenUsed="1"/>
+    <w:lsdException w:name="Table Grid 3" w:semiHidden="1" w:unhideWhenUsed="1"/>
+    <w:lsdException w:name="Table Grid 4" w:semiHidden="1" w:unhideWhenUsed="1"/>
+    <w:lsdException w:name="Table Grid 5" w:semiHidden="1" w:unhideWhenUsed="1"/>
+    <w:lsdException w:name="Table Grid 6" w:semiHidden="1" w:unhideWhenUsed="1"/>
+    <w:lsdException w:name="Table Grid 7" w:semiHidden="1" w:unhideWhenUsed="1"/>
+    <w:lsdException w:name="Table Grid 8" w:semiHidden="1" w:unhideWhenUsed="1"/>
+    <w:lsdException w:name="Table List 1" w:semiHidden="1" w:unhideWhenUsed="1"/>
+    <w:lsdException w:name="Table List 2" w:semiHidden="1" w:unhideWhenUsed="1"/>
+    <w:lsdException w:name="Table List 3" w:semiHidden="1" w:unhideWhenUsed="1"/>
+    <w:lsdException w:name="Table List 4" w:semiHidden="1" w:unhideWhenUsed="1"/>
+    <w:lsdException w:name="Table List 5" w:semiHidden="1" w:unhideWhenUsed="1"/>
+    <w:lsdException w:name="Table List 6" w:semiHidden="1" w:unhideWhenUsed="1"/>
+    <w:lsdException w:name="Table List 7" w:semiHidden="1" w:unhideWhenUsed="1"/>
+    <w:lsdException w:name="Table List 8" w:semiHidden="1" w:unhideWhenUsed="1"/>
+    <w:lsdException w:name="Table 3D effects 1" w:semiHidden="1" w:unhideWhenUsed="1"/>
+    <w:lsdException w:name="Table 3D effects 2" w:semiHidden="1" w:unhideWhenUsed="1"/>
+    <w:lsdException w:name="Table 3D effects 3" w:semiHidden="1" w:unhideWhenUsed="1"/>
+    <w:lsdException w:name="Table Contemporary" w:semiHidden="1" w:unhideWhenUsed="1"/>
+    <w:lsdException w:name="Table Elegant" w:semiHidden="1" w:unhideWhenUsed="1"/>
+    <w:lsdException w:name="Table Professional" w:semiHidden="1" w:unhideWhenUsed="1"/>
+    <w:lsdException w:name="Table Subtle 1" w:semiHidden="1" w:unhideWhenUsed="1"/>
+    <w:lsdException w:name="Table Subtle 2" w:semiHidden="1" w:unhideWhenUsed="1"/>
+    <w:lsdException w:name="Table Web 1" w:semiHidden="1" w:unhideWhenUsed="1"/>
+    <w:lsdException w:name="Table Web 2" w:semiHidden="1" w:unhideWhenUsed="1"/>
+    <w:lsdException w:name="Table Web 3" w:semiHidden="1" w:unhideWhenUsed="1"/>
+    <w:lsdException w:name="Balloon Text" w:semiHidden="1" w:unhideWhenUsed="1"/>
+    <w:lsdException w:name="Table Grid" w:uiPriority="39"/>
+    <w:lsdException w:name="Table Theme" w:semiHidden="1" w:unhideWhenUsed="1"/>
+    <w:lsdException w:name="Placeholder Text" w:semiHidden="1"/>
+    <w:lsdException w:name="No Spacing" w:uiPriority="1" w:qFormat="1"/>
+    <w:lsdException w:name="Light Shading" w:uiPriority="60"/>
+    <w:lsdException w:name="Light List" w:uiPriority="61"/>
+    <w:lsdException w:name="Light Grid" w:uiPriority="62"/>
+    <w:lsdException w:name="Medium Shading 1" w:uiPriority="63"/>
+    <w:lsdException w:name="Medium Shading 2" w:uiPriority="64"/>
+    <w:lsdException w:name="Medium List 1" w:uiPriority="65"/>
+    <w:lsdException w:name="Medium List 2" w:uiPriority="66"/>
+    <w:lsdException w:name="Medium Grid 1" w:uiPriority="67"/>
+    <w:lsdException w:name="Medium Grid 2" w:uiPriority="68"/>
+    <w:lsdException w:name="Medium Grid 3" w:uiPriority="69"/>
+    <w:lsdException w:name="Dark List" w:uiPriority="70"/>
+    <w:lsdException w:name="Colorful Shading" w:uiPriority="71"/>
+    <w:lsdException w:name="Colorful List" w:uiPriority="72"/>
+    <w:lsdException w:name="Colorful Grid" w:uiPriority="73"/>
+    <w:lsdException w:name="Light Shading Accent 1" w:uiPriority="60"/>
+    <w:lsdException w:name="Light List Accent 1" w:uiPriority="61"/>
+    <w:lsdException w:name="Light Grid Accent 1" w:uiPriority="62"/>
+    <w:lsdException w:name="Medium Shading 1 Accent 1" w:uiPriority="63"/>
+    <w:lsdException w:name="Medium Shading 2 Accent 1" w:uiPriority="64"/>
+    <w:lsdException w:name="Medium List 1 Accent 1" w:uiPriority="65"/>
+    <w:lsdException w:name="Revision" w:semiHidden="1"/>
+    <w:lsdException w:name="List Paragraph" w:uiPriority="34" w:qFormat="1"/>
+    <w:lsdException w:name="Quote" w:uiPriority="29" w:qFormat="1"/>
+    <w:lsdException w:name="Intense Quote" w:uiPriority="30" w:qFormat="1"/>
+    <w:lsdException w:name="Medium List 2 Accent 1" w:uiPriority="66"/>
+    <w:lsdException w:name="Medium Grid 1 Accent 1" w:uiPriority="67"/>
+    <w:lsdException w:name="Medium Grid 2 Accent 1" w:uiPriority="68"/>
+    <w:lsdException w:name="Medium Grid 3 Accent 1" w:uiPriority="69"/>
+    <w:lsdException w:name="Dark List Accent 1" w:uiPriority="70"/>
+    <w:lsdException w:name="Colorful Shading Accent 1" w:uiPriority="71"/>
+    <w:lsdException w:name="Colorful List Accent 1" w:uiPriority="72"/>
+    <w:lsdException w:name="Colorful Grid Accent 1" w:uiPriority="73"/>
+    <w:lsdException w:name="Light Shading Accent 2" w:uiPriority="60"/>
+    <w:lsdException w:name="Light List Accent 2" w:uiPriority="61"/>
+    <w:lsdException w:name="Light Grid Accent 2" w:uiPriority="62"/>
+    <w:lsdException w:name="Medium Shading 1 Accent 2" w:uiPriority="63"/>
+    <w:lsdException w:name="Medium Shading 2 Accent 2" w:uiPriority="64"/>
+    <w:lsdException w:name="Medium List 1 Accent 2" w:uiPriority="65"/>
+    <w:lsdException w:name="Medium List 2 Accent 2" w:uiPriority="66"/>
+    <w:lsdException w:name="Medium Grid 1 Accent 2" w:uiPriority="67"/>
+    <w:lsdException w:name="Medium Grid 2 Accent 2" w:uiPriority="68"/>
+    <w:lsdException w:name="Medium Grid 3 Accent 2" w:uiPriority="69"/>
+    <w:lsdException w:name="Dark List Accent 2" w:uiPriority="70"/>
+    <w:lsdException w:name="Colorful Shading Accent 2" w:uiPriority="71"/>
+    <w:lsdException w:name="Colorful List Accent 2" w:uiPriority="72"/>
+    <w:lsdException w:name="Colorful Grid Accent 2" w:uiPriority="73"/>
+    <w:lsdException w:name="Light Shading Accent 3" w:uiPriority="60"/>
+    <w:lsdException w:name="Light List Accent 3" w:uiPriority="61"/>
+    <w:lsdException w:name="Light Grid Accent 3" w:uiPriority="62"/>
+    <w:lsdException w:name="Medium Shading 1 Accent 3" w:uiPriority="63"/>
+    <w:lsdException w:name="Medium Shading 2 Accent 3" w:uiPriority="64"/>
+    <w:lsdException w:name="Medium List 1 Accent 3" w:uiPriority="65"/>
+    <w:lsdException w:name="Medium List 2 Accent 3" w:uiPriority="66"/>
+    <w:lsdException w:name="Medium Grid 1 Accent 3" w:uiPriority="67"/>
+    <w:lsdException w:name="Medium Grid 2 Accent 3" w:uiPriority="68"/>
+    <w:lsdException w:name="Medium Grid 3 Accent 3" w:uiPriority="69"/>
+    <w:lsdException w:name="Dark List Accent 3" w:uiPriority="70"/>
+    <w:lsdException w:name="Colorful Shading Accent 3" w:uiPriority="71"/>
+    <w:lsdException w:name="Colorful List Accent 3" w:uiPriority="72"/>
+    <w:lsdException w:name="Colorful Grid Accent 3" w:uiPriority="73"/>
+    <w:lsdException w:name="Light Shading Accent 4" w:uiPriority="60"/>
+    <w:lsdException w:name="Light List Accent 4" w:uiPriority="61"/>
+    <w:lsdException w:name="Light Grid Accent 4" w:uiPriority="62"/>
+    <w:lsdException w:name="Medium Shading 1 Accent 4" w:uiPriority="63"/>
+    <w:lsdException w:name="Medium Shading 2 Accent 4" w:uiPriority="64"/>
+    <w:lsdException w:name="Medium List 1 Accent 4" w:uiPriority="65"/>
+    <w:lsdException w:name="Medium List 2 Accent 4" w:uiPriority="66"/>
+    <w:lsdException w:name="Medium Grid 1 Accent 4" w:uiPriority="67"/>
+    <w:lsdException w:name="Medium Grid 2 Accent 4" w:uiPriority="68"/>
+    <w:lsdException w:name="Medium Grid 3 Accent 4" w:uiPriority="69"/>
+    <w:lsdException w:name="Dark List Accent 4" w:uiPriority="70"/>
+    <w:lsdException w:name="Colorful Shading Accent 4" w:uiPriority="71"/>
+    <w:lsdException w:name="Colorful List Accent 4" w:uiPriority="72"/>
+    <w:lsdException w:name="Colorful Grid Accent 4" w:uiPriority="73"/>
+    <w:lsdException w:name="Light Shading Accent 5" w:uiPriority="60"/>
+    <w:lsdException w:name="Light List Accent 5" w:uiPriority="61"/>
+    <w:lsdException w:name="Light Grid Accent 5" w:uiPriority="62"/>
+    <w:lsdException w:name="Medium Shading 1 Accent 5" w:uiPriority="63"/>
+    <w:lsdException w:name="Medium Shading 2 Accent 5" w:uiPriority="64"/>
+    <w:lsdException w:name="Medium List 1 Accent 5" w:uiPriority="65"/>
+    <w:lsdException w:name="Medium List 2 Accent 5" w:uiPriority="66"/>
+    <w:lsdException w:name="Medium Grid 1 Accent 5" w:uiPriority="67"/>
+    <w:lsdException w:name="Medium Grid 2 Accent 5" w:uiPriority="68"/>
+    <w:lsdException w:name="Medium Grid 3 Accent 5" w:uiPriority="69"/>
+    <w:lsdException w:name="Dark List Accent 5" w:uiPriority="70"/>
+    <w:lsdException w:name="Colorful Shading Accent 5" w:uiPriority="71"/>
+    <w:lsdException w:name="Colorful List Accent 5" w:uiPriority="72"/>
+    <w:lsdException w:name="Colorful Grid Accent 5" w:uiPriority="73"/>
+    <w:lsdException w:name="Light Shading Accent 6" w:uiPriority="60"/>
+    <w:lsdException w:name="Light List Accent 6" w:uiPriority="61"/>
+    <w:lsdException w:name="Light Grid Accent 6" w:uiPriority="62"/>
+    <w:lsdException w:name="Medium Shading 1 Accent 6" w:uiPriority="63"/>
+    <w:lsdException w:name="Medium Shading 2 Accent 6" w:uiPriority="64"/>
+    <w:lsdException w:name="Medium List 1 Accent 6" w:uiPriority="65"/>
+    <w:lsdException w:name="Medium List 2 Accent 6" w:uiPriority="66"/>
+    <w:lsdException w:name="Medium Grid 1 Accent 6" w:uiPriority="67"/>
+    <w:lsdException w:name="Medium Grid 2 Accent 6" w:uiPriority="68"/>
+    <w:lsdException w:name="Medium Grid 3 Accent 6" w:uiPriority="69"/>
+    <w:lsdException w:name="Dark List Accent 6" w:uiPriority="70"/>
+    <w:lsdException w:name="Colorful Shading Accent 6" w:uiPriority="71"/>
+    <w:lsdException w:name="Colorful List Accent 6" w:uiPriority="72"/>
+    <w:lsdException w:name="Colorful Grid Accent 6" w:uiPriority="73"/>
+    <w:lsdException w:name="Subtle Emphasis" w:uiPriority="19" w:qFormat="1"/>
+    <w:lsdException w:name="Intense Emphasis" w:uiPriority="21" w:qFormat="1"/>
+    <w:lsdException w:name="Subtle Reference" w:uiPriority="31" w:qFormat="1"/>
+    <w:lsdException w:name="Intense Reference" w:uiPriority="32" w:qFormat="1"/>
+    <w:lsdException w:name="Book Title" w:uiPriority="33" w:qFormat="1"/>
+    <w:lsdException w:name="Bibliography" w:semiHidden="1" w:uiPriority="37" w:unhideWhenUsed="1"/>
+    <w:lsdException w:name="TOC Heading" w:semiHidden="1" w:uiPriority="39" w:unhideWhenUsed="1" w:qFormat="1"/>
+    <w:lsdException w:name="Plain Table 1" w:uiPriority="41"/>
+    <w:lsdException w:name="Plain Table 2" w:uiPriority="42"/>
+    <w:lsdException w:name="Plain Table 3" w:uiPriority="43"/>
+    <w:lsdException w:name="Plain Table 4" w:uiPriority="44"/>
+    <w:lsdException w:name="Plain Table 5" w:uiPriority="45"/>
+    <w:lsdException w:name="Grid Table Light" w:uiPriority="40"/>
+    <w:lsdException w:name="Grid Table 1 Light" w:uiPriority="46"/>
+    <w:lsdException w:name="Grid Table 2" w:uiPriority="47"/>
+    <w:lsdException w:name="Grid Table 3" w:uiPriority="48"/>
+    <w:lsdException w:name="Grid Table 4" w:uiPriority="49"/>
+    <w:lsdException w:name="Grid Table 5 Dark" w:uiPriority="50"/>
+    <w:lsdException w:name="Grid Table 6 Colorful" w:uiPriority="51"/>
+    <w:lsdException w:name="Grid Table 7 Colorful" w:uiPriority="52"/>
+    <w:lsdException w:name="Grid Table 1 Light Accent 1" w:uiPriority="46"/>
+    <w:lsdException w:name="Grid Table 2 Accent 1" w:uiPriority="47"/>
+    <w:lsdException w:name="Grid Table 3 Accent 1" w:uiPriority="48"/>
+    <w:lsdException w:name="Grid Table 4 Accent 1" w:uiPriority="49"/>
+    <w:lsdException w:name="Grid Table 5 Dark Accent 1" w:uiPriority="50"/>
+    <w:lsdException w:name="Grid Table 6 Colorful Accent 1" w:uiPriority="51"/>
+    <w:lsdException w:name="Grid Table 7 Colorful Accent 1" w:uiPriority="52"/>
+    <w:lsdException w:name="Grid Table 1 Light Accent 2" w:uiPriority="46"/>
+    <w:lsdException w:name="Grid Table 2 Accent 2" w:uiPriority="47"/>
+    <w:lsdException w:name="Grid Table 3 Accent 2" w:uiPriority="48"/>
+    <w:lsdException w:name="Grid Table 4 Accent 2" w:uiPriority="49"/>
+    <w:lsdException w:name="Grid Table 5 Dark Accent 2" w:uiPriority="50"/>
+    <w:lsdException w:name="Grid Table 6 Colorful Accent 2" w:uiPriority="51"/>
+    <w:lsdException w:name="Grid Table 7 Colorful Accent 2" w:uiPriority="52"/>
+    <w:lsdException w:name="Grid Table 1 Light Accent 3" w:uiPriority="46"/>
+    <w:lsdException w:name="Grid Table 2 Accent 3" w:uiPriority="47"/>
+    <w:lsdException w:name="Grid Table 3 Accent 3" w:uiPriority="48"/>
+    <w:lsdException w:name="Grid Table 4 Accent 3" w:uiPriority="49"/>
+    <w:lsdException w:name="Grid Table 5 Dark Accent 3" w:uiPriority="50"/>
+    <w:lsdException w:name="Grid Table 6 Colorful Accent 3" w:uiPriority="51"/>
+    <w:lsdException w:name="Grid Table 7 Colorful Accent 3" w:uiPriority="52"/>
+    <w:lsdException w:name="Grid Table 1 Light Accent 4" w:uiPriority="46"/>
+    <w:lsdException w:name="Grid Table 2 Accent 4" w:uiPriority="47"/>
+    <w:lsdException w:name="Grid Table 3 Accent 4" w:uiPriority="48"/>
+    <w:lsdException w:name="Grid Table 4 Accent 4" w:uiPriority="49"/>
+    <w:lsdException w:name="Grid Table 5 Dark Accent 4" w:uiPriority="50"/>
+    <w:lsdException w:name="Grid Table 6 Colorful Accent 4" w:uiPriority="51"/>
+    <w:lsdException w:name="Grid Table 7 Colorful Accent 4" w:uiPriority="52"/>
+    <w:lsdException w:name="Grid Table 1 Light Accent 5" w:uiPriority="46"/>
+    <w:lsdException w:name="Grid Table 2 Accent 5" w:uiPriority="47"/>
+    <w:lsdException w:name="Grid Table 3 Accent 5" w:uiPriority="48"/>
+    <w:lsdException w:name="Grid Table 4 Accent 5" w:uiPriority="49"/>
+    <w:lsdException w:name="Grid Table 5 Dark Accent 5" w:uiPriority="50"/>
+    <w:lsdException w:name="Grid Table 6 Colorful Accent 5" w:uiPriority="51"/>
+    <w:lsdException w:name="Grid Table 7 Colorful Accent 5" w:uiPriority="52"/>
+    <w:lsdException w:name="Grid Table 1 Light Accent 6" w:uiPriority="46"/>
+    <w:lsdException w:name="Grid Table 2 Accent 6" w:uiPriority="47"/>
+    <w:lsdException w:name="Grid Table 3 Accent 6" w:uiPriority="48"/>
+    <w:lsdException w:name="Grid Table 4 Accent 6" w:uiPriority="49"/>
+    <w:lsdException w:name="Grid Table 5 Dark Accent 6" w:uiPriority="50"/>
+    <w:lsdException w:name="Grid Table 6 Colorful Accent 6" w:uiPriority="51"/>
+    <w:lsdException w:name="Grid Table 7 Colorful Accent 6" w:uiPriority="52"/>
+    <w:lsdException w:name="List Table 1 Light" w:uiPriority="46"/>
+    <w:lsdException w:name="List Table 2" w:uiPriority="47"/>
+    <w:lsdException w:name="List Table 3" w:uiPriority="48"/>
+    <w:lsdException w:name="List Table 4" w:uiPriority="49"/>
+    <w:lsdException w:name="List Table 5 Dark" w:uiPriority="50"/>
+    <w:lsdException w:name="List Table 6 Colorful" w:uiPriority="51"/>
+    <w:lsdException w:name="List Table 7 Colorful" w:uiPriority="52"/>
+    <w:lsdException w:name="List Table 1 Light Accent 1" w:uiPriority="46"/>
+    <w:lsdException w:name="List Table 2 Accent 1" w:uiPriority="47"/>
+    <w:lsdException w:name="List Table 3 Accent 1" w:uiPriority="48"/>
+    <w:lsdException w:name="List Table 4 Accent 1" w:uiPriority="49"/>
+    <w:lsdException w:name="List Table 5 Dark Accent 1" w:uiPriority="50"/>
+    <w:lsdException w:name="List Table 6 Colorful Accent 1" w:uiPriority="51"/>
+    <w:lsdException w:name="List Table 7 Colorful Accent 1" w:uiPriority="52"/>
+    <w:lsdException w:name="List Table 1 Light Accent 2" w:uiPriority="46"/>
+    <w:lsdException w:name="List Table 2 Accent 2" w:uiPriority="47"/>
+    <w:lsdException w:name="List Table 3 Accent 2" w:uiPriority="48"/>
+    <w:lsdException w:name="List Table 4 Accent 2" w:uiPriority="49"/>
+    <w:lsdException w:name="List Table 5 Dark Accent 2" w:uiPriority="50"/>
+    <w:lsdException w:name="List Table 6 Colorful Accent 2" w:uiPriority="51"/>
+    <w:lsdException w:name="List Table 7 Colorful Accent 2" w:uiPriority="52"/>
+    <w:lsdException w:name="List Table 1 Light Accent 3" w:uiPriority="46"/>
+    <w:lsdException w:name="List Table 2 Accent 3" w:uiPriority="47"/>
+    <w:lsdException w:name="List Table 3 Accent 3" w:uiPriority="48"/>
+    <w:lsdException w:name="List Table 4 Accent 3" w:uiPriority="49"/>
+    <w:lsdException w:name="List Table 5 Dark Accent 3" w:uiPriority="50"/>
+    <w:lsdException w:name="List Table 6 Colorful Accent 3" w:uiPriority="51"/>
+    <w:lsdException w:name="List Table 7 Colorful Accent 3" w:uiPriority="52"/>
+    <w:lsdException w:name="List Table 1 Light Accent 4" w:uiPriority="46"/>
+    <w:lsdException w:name="List Table 2 Accent 4" w:uiPriority="47"/>
+    <w:lsdException w:name="List Table 3 Accent 4" w:uiPriority="48"/>
+    <w:lsdException w:name="List Table 4 Accent 4" w:uiPriority="49"/>
+    <w:lsdException w:name="List Table 5 Dark Accent 4" w:uiPriority="50"/>
+    <w:lsdException w:name="List Table 6 Colorful Accent 4" w:uiPriority="51"/>
+    <w:lsdException w:name="List Table 7 Colorful Accent 4" w:uiPriority="52"/>
+    <w:lsdException w:name="List Table 1 Light Accent 5" w:uiPriority="46"/>
+    <w:lsdException w:name="List Table 2 Accent 5" w:uiPriority="47"/>
+    <w:lsdException w:name="List Table 3 Accent 5" w:uiPriority="48"/>
+    <w:lsdException w:name="List Table 4 Accent 5" w:uiPriority="49"/>
+    <w:lsdException w:name="List Table 5 Dark Accent 5" w:uiPriority="50"/>
+    <w:lsdException w:name="List Table 6 Colorful Accent 5" w:uiPriority="51"/>
+    <w:lsdException w:name="List Table 7 Colorful Accent 5" w:uiPriority="52"/>
+    <w:lsdException w:name="List Table 1 Light Accent 6" w:uiPriority="46"/>
+    <w:lsdException w:name="List Table 2 Accent 6" w:uiPriority="47"/>
+    <w:lsdException w:name="List Table 3 Accent 6" w:uiPriority="48"/>
+    <w:lsdException w:name="List Table 4 Accent 6" w:uiPriority="49"/>
+    <w:lsdException w:name="List Table 5 Dark Accent 6" w:uiPriority="50"/>
+    <w:lsdException w:name="List Table 6 Colorful Accent 6" w:uiPriority="51"/>
+    <w:lsdException w:name="List Table 7 Colorful Accent 6" w:uiPriority="52"/>
+    <w:lsdException w:name="Mention" w:semiHidden="1" w:unhideWhenUsed="1"/>
+    <w:lsdException w:name="Smart Hyperlink" w:semiHidden="1" w:unhideWhenUsed="1"/>
+    <w:lsdException w:name="Hashtag" w:semiHidden="1" w:unhideWhenUsed="1"/>
+    <w:lsdException w:name="Unresolved Mention" w:semiHidden="1" w:unhideWhenUsed="1"/>
+    <w:lsdException w:name="Smart Link" w:semiHidden="1" w:unhideWhenUsed="1"/>
+  </w:latentStyles>
   <w:style w:type="paragraph" w:default="1" w:styleId="Normal">
     <w:name w:val="Normal"/>
+    <w:qFormat/>
+  </w:style>
+  <w:style w:type="character" w:default="1" w:styleId="DefaultParagraphFont">
+    <w:name w:val="Default Paragraph Font"/>
+    <w:uiPriority w:val="1"/>
+    <w:semiHidden/>
+    <w:unhideWhenUsed/>
+  </w:style>
+  <w:style w:type="table" w:default="1" w:styleId="TableNormal">
+    <w:name w:val="Normal Table"/>
+    <w:uiPriority w:val="99"/>
+    <w:semiHidden/>
+    <w:unhideWhenUsed/>
+    <w:tblPr>
+      <w:tblInd w:w="0" w:type="dxa"/>
+      <w:tblCellMar>
+        <w:top w:w="0" w:type="dxa"/>
+        <w:left w:w="108" w:type="dxa"/>
+        <w:bottom w:w="0" w:type="dxa"/>
+        <w:right w:w="108" w:type="dxa"/>
+      </w:tblCellMar>
+    </w:tblPr>
+  </w:style>
+  <w:style w:type="numbering" w:default="1" w:styleId="NoList">
+    <w:name w:val="No List"/>
+    <w:uiPriority w:val="99"/>
+    <w:semiHidden/>
+    <w:unhideWhenUsed/>
   </w:style>
 </w:styles>
+</file>
+
+<file path=word/theme/theme1.xml><?xml version="1.0" encoding="utf-8"?>
+<a:theme xmlns:a="http://schemas.openxmlformats.org/drawingml/2006/main" name="Office Theme">
+  <a:themeElements>
+    <a:clrScheme name="Office">
+      <a:dk1>
+        <a:sysClr val="windowText" lastClr="000000"/>
+      </a:dk1>
+      <a:lt1>
+        <a:sysClr val="window" lastClr="FFFFFF"/>
+      </a:lt1>
+      <a:dk2>
+        <a:srgbClr val="0E2841"/>
+      </a:dk2>
+      <a:lt2>
+        <a:srgbClr val="E8E8E8"/>
+      </a:lt2>
+      <a:accent1>
+        <a:srgbClr val="156082"/>
+      </a:accent1>
+      <a:accent2>
+        <a:srgbClr val="E97132"/>
+      </a:accent2>
+      <a:accent3>
+        <a:srgbClr val="196B24"/>
+      </a:accent3>
+      <a:accent4>
+        <a:srgbClr val="0F9ED5"/>
+      </a:accent4>
+      <a:accent5>
+        <a:srgbClr val="A02B93"/>
+      </a:accent5>
+      <a:accent6>
+        <a:srgbClr val="4EA72E"/>
+      </a:accent6>
+      <a:hlink>
+        <a:srgbClr val="467886"/>
+      </a:hlink>
+      <a:folHlink>
+        <a:srgbClr val="96607D"/>
+      </a:folHlink>
+    </a:clrScheme>
+    <a:fontScheme name="Office">
+      <a:majorFont>
+        <a:latin typeface="Aptos Display" panose="02110004020202020204"/>
+        <a:ea typeface=""/>
+        <a:cs typeface=""/>
+        <a:font script="Jpan" typeface="游ゴシック Light"/>
+        <a:font script="Hang" typeface="맑은 고딕"/>
+        <a:font script="Hans" typeface="等线 Light"/>
+        <a:font script="Hant" typeface="新細明體"/>
+        <a:font script="Arab" typeface="Times New Roman"/>
+        <a:font script="Hebr" typeface="Times New Roman"/>
+        <a:font script="Thai" typeface="Angsana New"/>
+        <a:font script="Ethi" typeface="Nyala"/>
+        <a:font script="Beng" typeface="Vrinda"/>
+        <a:font script="Gujr" typeface="Shruti"/>
+        <a:font script="Khmr" typeface="MoolBoran"/>
+        <a:font script="Knda" typeface="Tunga"/>
+        <a:font script="Guru" typeface="Raavi"/>
+        <a:font script="Cans" typeface="Euphemia"/>
+        <a:font script="Cher" typeface="Plantagenet Cherokee"/>
+        <a:font script="Yiii" typeface="Microsoft Yi Baiti"/>
+        <a:font script="Tibt" typeface="Microsoft Himalaya"/>
+        <a:font script="Thaa" typeface="MV Boli"/>
+        <a:font script="Deva" typeface="Mangal"/>
+        <a:font script="Telu" typeface="Gautami"/>
+        <a:font script="Taml" typeface="Latha"/>
+        <a:font script="Syrc" typeface="Estrangelo Edessa"/>
+        <a:font script="Orya" typeface="Kalinga"/>
+        <a:font script="Mlym" typeface="Kartika"/>
+        <a:font script="Laoo" typeface="DokChampa"/>
+        <a:font script="Sinh" typeface="Iskoola Pota"/>
+        <a:font script="Mong" typeface="Mongolian Baiti"/>
+        <a:font script="Viet" typeface="Times New Roman"/>
+        <a:font script="Uigh" typeface="Microsoft Uighur"/>
+        <a:font script="Geor" typeface="Sylfaen"/>
+        <a:font script="Armn" typeface="Arial"/>
+        <a:font script="Bugi" typeface="Leelawadee UI"/>
+        <a:font script="Bopo" typeface="Microsoft JhengHei"/>
+        <a:font script="Java" typeface="Javanese Text"/>
+        <a:font script="Lisu" typeface="Segoe UI"/>
+        <a:font script="Mymr" typeface="Myanmar Text"/>
+        <a:font script="Nkoo" typeface="Ebrima"/>
+        <a:font script="Olck" typeface="Nirmala UI"/>
+        <a:font script="Osma" typeface="Ebrima"/>
+        <a:font script="Phag" typeface="Phagspa"/>
+        <a:font script="Syrn" typeface="Estrangelo Edessa"/>
+        <a:font script="Syrj" typeface="Estrangelo Edessa"/>
+        <a:font script="Syre" typeface="Estrangelo Edessa"/>
+        <a:font script="Sora" typeface="Nirmala UI"/>
+        <a:font script="Tale" typeface="Microsoft Tai Le"/>
+        <a:font script="Talu" typeface="Microsoft New Tai Lue"/>
+        <a:font script="Tfng" typeface="Ebrima"/>
+      </a:majorFont>
+      <a:minorFont>
+        <a:latin typeface="Aptos" panose="02110004020202020204"/>
+        <a:ea typeface=""/>
+        <a:cs typeface=""/>
+        <a:font script="Jpan" typeface="游明朝"/>
+        <a:font script="Hang" typeface="맑은 고딕"/>
+        <a:font script="Hans" typeface="等线"/>
+        <a:font script="Hant" typeface="新細明體"/>
+        <a:font script="Arab" typeface="Arial"/>
+        <a:font script="Hebr" typeface="Arial"/>
+        <a:font script="Thai" typeface="Cordia New"/>
+        <a:font script="Ethi" typeface="Nyala"/>
+        <a:font script="Beng" typeface="Vrinda"/>
+        <a:font script="Gujr" typeface="Shruti"/>
+        <a:font script="Khmr" typeface="DaunPenh"/>
+        <a:font script="Knda" typeface="Tunga"/>
+        <a:font script="Guru" typeface="Raavi"/>
+        <a:font script="Cans" typeface="Euphemia"/>
+        <a:font script="Cher" typeface="Plantagenet Cherokee"/>
+        <a:font script="Yiii" typeface="Microsoft Yi Baiti"/>
+        <a:font script="Tibt" typeface="Microsoft Himalaya"/>
+        <a:font script="Thaa" typeface="MV Boli"/>
+        <a:font script="Deva" typeface="Mangal"/>
+        <a:font script="Telu" typeface="Gautami"/>
+        <a:font script="Taml" typeface="Latha"/>
+        <a:font script="Syrc" typeface="Estrangelo Edessa"/>
+        <a:font script="Orya" typeface="Kalinga"/>
+        <a:font script="Mlym" typeface="Kartika"/>
+        <a:font script="Laoo" typeface="DokChampa"/>
+        <a:font script="Sinh" typeface="Iskoola Pota"/>
+        <a:font script="Mong" typeface="Mongolian Baiti"/>
+        <a:font script="Viet" typeface="Arial"/>
+        <a:font script="Uigh" typeface="Microsoft Uighur"/>
+        <a:font script="Geor" typeface="Sylfaen"/>
+        <a:font script="Armn" typeface="Arial"/>
+        <a:font script="Bugi" typeface="Leelawadee UI"/>
+        <a:font script="Bopo" typeface="Microsoft JhengHei"/>
+        <a:font script="Java" typeface="Javanese Text"/>
+        <a:font script="Lisu" typeface="Segoe UI"/>
+        <a:font script="Mymr" typeface="Myanmar Text"/>
+        <a:font script="Nkoo" typeface="Ebrima"/>
+        <a:font script="Olck" typeface="Nirmala UI"/>
+        <a:font script="Osma" typeface="Ebrima"/>
+        <a:font script="Phag" typeface="Phagspa"/>
+        <a:font script="Syrn" typeface="Estrangelo Edessa"/>
+        <a:font script="Syrj" typeface="Estrangelo Edessa"/>
+        <a:font script="Syre" typeface="Estrangelo Edessa"/>
+        <a:font script="Sora" typeface="Nirmala UI"/>
+        <a:font script="Tale" typeface="Microsoft Tai Le"/>
+        <a:font script="Talu" typeface="Microsoft New Tai Lue"/>
+        <a:font script="Tfng" typeface="Ebrima"/>
+      </a:minorFont>
+    </a:fontScheme>
+    <a:fmtScheme name="Office">
+      <a:fillStyleLst>
+        <a:solidFill>
+          <a:schemeClr val="phClr"/>
+        </a:solidFill>
+        <a:gradFill rotWithShape="1">
+          <a:gsLst>
+            <a:gs pos="0">
+              <a:schemeClr val="phClr">
+                <a:lumMod val="110000"/>
+                <a:satMod val="105000"/>
+                <a:tint val="67000"/>
+              </a:schemeClr>
+            </a:gs>
+            <a:gs pos="50000">
+              <a:schemeClr val="phClr">
+                <a:lumMod val="105000"/>
+                <a:satMod val="103000"/>
+                <a:tint val="73000"/>
+              </a:schemeClr>
+            </a:gs>
+            <a:gs pos="100000">
+              <a:schemeClr val="phClr">
+                <a:lumMod val="105000"/>
+                <a:satMod val="109000"/>
+                <a:tint val="81000"/>
+              </a:schemeClr>
+            </a:gs>
+          </a:gsLst>
+          <a:lin ang="5400000" scaled="0"/>
+        </a:gradFill>
+        <a:gradFill rotWithShape="1">
+          <a:gsLst>
+            <a:gs pos="0">
+              <a:schemeClr val="phClr">
+                <a:satMod val="103000"/>
+                <a:lumMod val="102000"/>
+                <a:tint val="94000"/>
+              </a:schemeClr>
+            </a:gs>
+            <a:gs pos="50000">
+              <a:schemeClr val="phClr">
+                <a:satMod val="110000"/>
+                <a:lumMod val="100000"/>
+                <a:shade val="100000"/>
+              </a:schemeClr>
+            </a:gs>
+            <a:gs pos="100000">
+              <a:schemeClr val="phClr">
+                <a:lumMod val="99000"/>
+                <a:satMod val="120000"/>
+                <a:shade val="78000"/>
+              </a:schemeClr>
+            </a:gs>
+          </a:gsLst>
+          <a:lin ang="5400000" scaled="0"/>
+        </a:gradFill>
+      </a:fillStyleLst>
+      <a:lnStyleLst>
+        <a:ln w="12700" cap="flat" cmpd="sng" algn="ctr">
+          <a:solidFill>
+            <a:schemeClr val="phClr"/>
+          </a:solidFill>
+          <a:prstDash val="solid"/>
+          <a:miter lim="800000"/>
+        </a:ln>
+        <a:ln w="19050" cap="flat" cmpd="sng" algn="ctr">
+          <a:solidFill>
+            <a:schemeClr val="phClr"/>
+          </a:solidFill>
+          <a:prstDash val="solid"/>
+          <a:miter lim="800000"/>
+        </a:ln>
+        <a:ln w="25400" cap="flat" cmpd="sng" algn="ctr">
+          <a:solidFill>
+            <a:schemeClr val="phClr"/>
+          </a:solidFill>
+          <a:prstDash val="solid"/>
+          <a:miter lim="800000"/>
+        </a:ln>
+      </a:lnStyleLst>
+      <a:effectStyleLst>
+        <a:effectStyle>
+          <a:effectLst/>
+        </a:effectStyle>
+        <a:effectStyle>
+          <a:effectLst/>
+        </a:effectStyle>
+        <a:effectStyle>
+          <a:effectLst>
+            <a:outerShdw blurRad="57150" dist="19050" dir="5400000" algn="ctr" rotWithShape="0">
+              <a:srgbClr val="000000">
+                <a:alpha val="63000"/>
+              </a:srgbClr>
+            </a:outerShdw>
+          </a:effectLst>
+        </a:effectStyle>
+      </a:effectStyleLst>
+      <a:bgFillStyleLst>
+        <a:solidFill>
+          <a:schemeClr val="phClr"/>
+        </a:solidFill>
+        <a:solidFill>
+          <a:schemeClr val="phClr">
+            <a:tint val="95000"/>
+            <a:satMod val="170000"/>
+          </a:schemeClr>
+        </a:solidFill>
+        <a:gradFill rotWithShape="1">
+          <a:gsLst>
+            <a:gs pos="0">
+              <a:schemeClr val="phClr">
+                <a:tint val="93000"/>
+                <a:satMod val="150000"/>
+                <a:shade val="98000"/>
+                <a:lumMod val="102000"/>
+              </a:schemeClr>
+            </a:gs>
+            <a:gs pos="50000">
+              <a:schemeClr val="phClr">
+                <a:tint val="98000"/>
+                <a:satMod val="130000"/>
+                <a:shade val="90000"/>
+                <a:lumMod val="103000"/>
+              </a:schemeClr>
+            </a:gs>
+            <a:gs pos="100000">
+              <a:schemeClr val="phClr">
+                <a:shade val="63000"/>
+                <a:satMod val="120000"/>
+              </a:schemeClr>
+            </a:gs>
+          </a:gsLst>
+          <a:lin ang="5400000" scaled="0"/>
+        </a:gradFill>
+      </a:bgFillStyleLst>
+    </a:fmtScheme>
+  </a:themeElements>
+  <a:objectDefaults>
+    <a:lnDef>
+      <a:spPr/>
+      <a:bodyPr/>
+      <a:lstStyle/>
+      <a:style>
+        <a:lnRef idx="2">
+          <a:schemeClr val="accent1"/>
+        </a:lnRef>
+        <a:fillRef idx="0">
+          <a:schemeClr val="accent1"/>
+        </a:fillRef>
+        <a:effectRef idx="1">
+          <a:schemeClr val="accent1"/>
+        </a:effectRef>
+        <a:fontRef idx="minor">
+          <a:schemeClr val="tx1"/>
+        </a:fontRef>
+      </a:style>
+    </a:lnDef>
+  </a:objectDefaults>
+  <a:extraClrSchemeLst/>
+  <a:extLst>
+    <a:ext uri="{05A4C25C-085E-4340-85A3-A5531E510DB2}">
+      <thm15:themeFamily xmlns:thm15="http://schemas.microsoft.com/office/thememl/2012/main" name="Office Theme" id="{2E142A2C-CD16-42D6-873A-C26D2A0506FA}" vid="{1BDDFF52-6CD6-40A5-AB3C-68EB2F1E4D0A}"/>
+    </a:ext>
+  </a:extLst>
+</a:theme>
 </file>
</xml_diff>